<commit_message>
Update project brief to latest version from main
Syncs the updated brief onto the working branch: adds the JetEngine content
structure (section 5), KDNA Reading Time companion for read time, three-level
image fallback, character entity conversion, and the expanded Stage 4 detail.

Co-Authored-By: Claude Opus 4.8 <noreply@anthropic.com>
Claude-Session: https://claude.ai/code/session_01WNynY8Vv573dLf63AGXRaS
</commit_message>
<xml_diff>
--- a/KDNA-Article-Broadcast-PROJECT-BRIEF.docx
+++ b/KDNA-Article-Broadcast-PROJECT-BRIEF.docx
@@ -1132,6 +1132,120 @@
                 <w:sz w:val="18"/>
                 <w:szCs w:val="18"/>
               </w:rPr>
+              <w:t xml:space="preserve">JetEngine dependency</w:t>
+            </w:r>
+          </w:p>
+        </w:tc>
+        <w:tc>
+          <w:tcPr>
+            <w:tcW w:type="dxa" w:w="5826"/>
+            <w:shd w:fill="EDEFEE" w:color="auto" w:val="clear"/>
+            <w:tcMar>
+              <w:top w:type="dxa" w:w="90"/>
+              <w:left w:type="dxa" w:w="120"/>
+              <w:bottom w:type="dxa" w:w="90"/>
+              <w:right w:type="dxa" w:w="120"/>
+            </w:tcMar>
+          </w:tcPr>
+          <w:p>
+            <w:pPr>
+              <w:spacing w:after="0"/>
+            </w:pPr>
+            <w:r>
+              <w:rPr>
+                <w:rFonts w:ascii="Montserrat" w:cs="Montserrat" w:eastAsia="Montserrat" w:hAnsi="Montserrat"/>
+                <w:b w:val="false"/>
+                <w:bCs w:val="false"/>
+                <w:color w:val="111111"/>
+                <w:sz w:val="18"/>
+                <w:szCs w:val="18"/>
+              </w:rPr>
+              <w:t xml:space="preserve">Yes, article content is stored in JetEngine meta and repeater fields</w:t>
+            </w:r>
+          </w:p>
+        </w:tc>
+      </w:tr>
+      <w:tr>
+        <w:tc>
+          <w:tcPr>
+            <w:tcW w:type="dxa" w:w="3200"/>
+            <w:tcMar>
+              <w:top w:type="dxa" w:w="90"/>
+              <w:left w:type="dxa" w:w="120"/>
+              <w:bottom w:type="dxa" w:w="90"/>
+              <w:right w:type="dxa" w:w="120"/>
+            </w:tcMar>
+          </w:tcPr>
+          <w:p>
+            <w:pPr>
+              <w:spacing w:after="0"/>
+            </w:pPr>
+            <w:r>
+              <w:rPr>
+                <w:rFonts w:ascii="Montserrat" w:cs="Montserrat" w:eastAsia="Montserrat" w:hAnsi="Montserrat"/>
+                <w:b w:val="false"/>
+                <w:bCs w:val="false"/>
+                <w:color w:val="111111"/>
+                <w:sz w:val="18"/>
+                <w:szCs w:val="18"/>
+              </w:rPr>
+              <w:t xml:space="preserve">Companion plugin</w:t>
+            </w:r>
+          </w:p>
+        </w:tc>
+        <w:tc>
+          <w:tcPr>
+            <w:tcW w:type="dxa" w:w="5826"/>
+            <w:tcMar>
+              <w:top w:type="dxa" w:w="90"/>
+              <w:left w:type="dxa" w:w="120"/>
+              <w:bottom w:type="dxa" w:w="90"/>
+              <w:right w:type="dxa" w:w="120"/>
+            </w:tcMar>
+          </w:tcPr>
+          <w:p>
+            <w:pPr>
+              <w:spacing w:after="0"/>
+            </w:pPr>
+            <w:r>
+              <w:rPr>
+                <w:rFonts w:ascii="Montserrat" w:cs="Montserrat" w:eastAsia="Montserrat" w:hAnsi="Montserrat"/>
+                <w:b w:val="false"/>
+                <w:bCs w:val="false"/>
+                <w:color w:val="111111"/>
+                <w:sz w:val="18"/>
+                <w:szCs w:val="18"/>
+              </w:rPr>
+              <w:t xml:space="preserve">KDNA Reading Time, optional, supplies the read time figure</w:t>
+            </w:r>
+          </w:p>
+        </w:tc>
+      </w:tr>
+      <w:tr>
+        <w:tc>
+          <w:tcPr>
+            <w:tcW w:type="dxa" w:w="3200"/>
+            <w:shd w:fill="EDEFEE" w:color="auto" w:val="clear"/>
+            <w:tcMar>
+              <w:top w:type="dxa" w:w="90"/>
+              <w:left w:type="dxa" w:w="120"/>
+              <w:bottom w:type="dxa" w:w="90"/>
+              <w:right w:type="dxa" w:w="120"/>
+            </w:tcMar>
+          </w:tcPr>
+          <w:p>
+            <w:pPr>
+              <w:spacing w:after="0"/>
+            </w:pPr>
+            <w:r>
+              <w:rPr>
+                <w:rFonts w:ascii="Montserrat" w:cs="Montserrat" w:eastAsia="Montserrat" w:hAnsi="Montserrat"/>
+                <w:b w:val="false"/>
+                <w:bCs w:val="false"/>
+                <w:color w:val="111111"/>
+                <w:sz w:val="18"/>
+                <w:szCs w:val="18"/>
+              </w:rPr>
               <w:t xml:space="preserve">Custom post types</w:t>
             </w:r>
           </w:p>
@@ -1839,7 +1953,7 @@
                 <w:sz w:val="18"/>
                 <w:szCs w:val="18"/>
               </w:rPr>
-              <w:t xml:space="preserve">Teaser source</w:t>
+              <w:t xml:space="preserve">Where article content lives</w:t>
             </w:r>
           </w:p>
         </w:tc>
@@ -1866,7 +1980,7 @@
                 <w:sz w:val="18"/>
                 <w:szCs w:val="18"/>
               </w:rPr>
-              <w:t xml:space="preserve">Auto-generated with a configurable word count, plus an optional per-post override box</w:t>
+              <w:t xml:space="preserve">JetEngine fields, not post_content. An intro field plus an article_sections repeater</w:t>
             </w:r>
           </w:p>
         </w:tc>
@@ -1896,7 +2010,7 @@
                 <w:sz w:val="18"/>
                 <w:szCs w:val="18"/>
               </w:rPr>
-              <w:t xml:space="preserve">Subject line</w:t>
+              <w:t xml:space="preserve">Teaser source</w:t>
             </w:r>
           </w:p>
         </w:tc>
@@ -1924,7 +2038,7 @@
                 <w:sz w:val="18"/>
                 <w:szCs w:val="18"/>
               </w:rPr>
-              <w:t xml:space="preserve">Per-post field, pre-filled with the post title</w:t>
+              <w:t xml:space="preserve">Intro field first, continuing into the first repeater row only if the word count is not met, plus an optional per-post override box</w:t>
             </w:r>
           </w:p>
         </w:tc>
@@ -1953,7 +2067,7 @@
                 <w:sz w:val="18"/>
                 <w:szCs w:val="18"/>
               </w:rPr>
-              <w:t xml:space="preserve">Send checkbox</w:t>
+              <w:t xml:space="preserve">Email image</w:t>
             </w:r>
           </w:p>
         </w:tc>
@@ -1980,7 +2094,7 @@
                 <w:sz w:val="18"/>
                 <w:szCs w:val="18"/>
               </w:rPr>
-              <w:t xml:space="preserve">Present on every post, unticked by default</w:t>
+              <w:t xml:space="preserve">WordPress featured image, falling back to the first repeater row section image, then a placeholder</w:t>
             </w:r>
           </w:p>
         </w:tc>
@@ -2010,7 +2124,7 @@
                 <w:sz w:val="18"/>
                 <w:szCs w:val="18"/>
               </w:rPr>
-              <w:t xml:space="preserve">Resend protection</w:t>
+              <w:t xml:space="preserve">Read time</w:t>
             </w:r>
           </w:p>
         </w:tc>
@@ -2038,7 +2152,7 @@
                 <w:sz w:val="18"/>
                 <w:szCs w:val="18"/>
               </w:rPr>
-              <w:t xml:space="preserve">Locked after sending, with an unlock and resend button for emergencies</w:t>
+              <w:t xml:space="preserve">Read from the existing KDNA Reading Time plugin, never recalculated, omitted if that plugin is inactive</w:t>
             </w:r>
           </w:p>
         </w:tc>
@@ -2067,7 +2181,7 @@
                 <w:sz w:val="18"/>
                 <w:szCs w:val="18"/>
               </w:rPr>
-              <w:t xml:space="preserve">Test sends</w:t>
+              <w:t xml:space="preserve">Subject line</w:t>
             </w:r>
           </w:p>
         </w:tc>
@@ -2094,7 +2208,7 @@
                 <w:sz w:val="18"/>
                 <w:szCs w:val="18"/>
               </w:rPr>
-              <w:t xml:space="preserve">Button in the post editor plus standing extra test addresses, with final preview in Campaign Monitor</w:t>
+              <w:t xml:space="preserve">Per-post field, pre-filled with the post title</w:t>
             </w:r>
           </w:p>
         </w:tc>
@@ -2124,7 +2238,7 @@
                 <w:sz w:val="18"/>
                 <w:szCs w:val="18"/>
               </w:rPr>
-              <w:t xml:space="preserve">API failure</w:t>
+              <w:t xml:space="preserve">Send checkbox</w:t>
             </w:r>
           </w:p>
         </w:tc>
@@ -2152,7 +2266,7 @@
                 <w:sz w:val="18"/>
                 <w:szCs w:val="18"/>
               </w:rPr>
-              <w:t xml:space="preserve">Retry three times over an hour, then email Nick</w:t>
+              <w:t xml:space="preserve">Present on every post, unticked by default</w:t>
             </w:r>
           </w:p>
         </w:tc>
@@ -2181,7 +2295,7 @@
                 <w:sz w:val="18"/>
                 <w:szCs w:val="18"/>
               </w:rPr>
-              <w:t xml:space="preserve">UTM tracking</w:t>
+              <w:t xml:space="preserve">Resend protection</w:t>
             </w:r>
           </w:p>
         </w:tc>
@@ -2208,7 +2322,7 @@
                 <w:sz w:val="18"/>
                 <w:szCs w:val="18"/>
               </w:rPr>
-              <w:t xml:space="preserve">Yes, added automatically, with editable values</w:t>
+              <w:t xml:space="preserve">Locked after sending, with an unlock and resend button for emergencies</w:t>
             </w:r>
           </w:p>
         </w:tc>
@@ -2238,7 +2352,7 @@
                 <w:sz w:val="18"/>
                 <w:szCs w:val="18"/>
               </w:rPr>
-              <w:t xml:space="preserve">Signup form fields</w:t>
+              <w:t xml:space="preserve">Test sends</w:t>
             </w:r>
           </w:p>
         </w:tc>
@@ -2266,7 +2380,7 @@
                 <w:sz w:val="18"/>
                 <w:szCs w:val="18"/>
               </w:rPr>
-              <w:t xml:space="preserve">Name and email</w:t>
+              <w:t xml:space="preserve">Button in the post editor plus standing extra test addresses, with final preview in Campaign Monitor</w:t>
             </w:r>
           </w:p>
         </w:tc>
@@ -2295,7 +2409,7 @@
                 <w:sz w:val="18"/>
                 <w:szCs w:val="18"/>
               </w:rPr>
-              <w:t xml:space="preserve">Signup form layout</w:t>
+              <w:t xml:space="preserve">API failure</w:t>
             </w:r>
           </w:p>
         </w:tc>
@@ -2322,7 +2436,7 @@
                 <w:sz w:val="18"/>
                 <w:szCs w:val="18"/>
               </w:rPr>
-              <w:t xml:space="preserve">Switcher per widget instance, stacked or inline</w:t>
+              <w:t xml:space="preserve">Retry three times over an hour, then email Nick</w:t>
             </w:r>
           </w:p>
         </w:tc>
@@ -2352,7 +2466,7 @@
                 <w:sz w:val="18"/>
                 <w:szCs w:val="18"/>
               </w:rPr>
-              <w:t xml:space="preserve">Opt-in method</w:t>
+              <w:t xml:space="preserve">UTM tracking</w:t>
             </w:r>
           </w:p>
         </w:tc>
@@ -2380,7 +2494,7 @@
                 <w:sz w:val="18"/>
                 <w:szCs w:val="18"/>
               </w:rPr>
-              <w:t xml:space="preserve">Double opt-in</w:t>
+              <w:t xml:space="preserve">Yes, added automatically, with editable values</w:t>
             </w:r>
           </w:p>
         </w:tc>
@@ -2409,7 +2523,7 @@
                 <w:sz w:val="18"/>
                 <w:szCs w:val="18"/>
               </w:rPr>
-              <w:t xml:space="preserve">Spam protection</w:t>
+              <w:t xml:space="preserve">Signup form fields</w:t>
             </w:r>
           </w:p>
         </w:tc>
@@ -2436,7 +2550,7 @@
                 <w:sz w:val="18"/>
                 <w:szCs w:val="18"/>
               </w:rPr>
-              <w:t xml:space="preserve">reCAPTCHA v3, invisible, plus a honeypot field</w:t>
+              <w:t xml:space="preserve">Name and email</w:t>
             </w:r>
           </w:p>
         </w:tc>
@@ -2466,7 +2580,7 @@
                 <w:sz w:val="18"/>
                 <w:szCs w:val="18"/>
               </w:rPr>
-              <w:t xml:space="preserve">Consent checkbox</w:t>
+              <w:t xml:space="preserve">Signup form layout</w:t>
             </w:r>
           </w:p>
         </w:tc>
@@ -2494,7 +2608,7 @@
                 <w:sz w:val="18"/>
                 <w:szCs w:val="18"/>
               </w:rPr>
-              <w:t xml:space="preserve">None, consent implied by submitting, with metadata recorded</w:t>
+              <w:t xml:space="preserve">Switcher per widget instance, stacked or inline</w:t>
             </w:r>
           </w:p>
         </w:tc>
@@ -2523,7 +2637,7 @@
                 <w:sz w:val="18"/>
                 <w:szCs w:val="18"/>
               </w:rPr>
-              <w:t xml:space="preserve">Signup success behaviour</w:t>
+              <w:t xml:space="preserve">Opt-in method</w:t>
             </w:r>
           </w:p>
         </w:tc>
@@ -2550,7 +2664,7 @@
                 <w:sz w:val="18"/>
                 <w:szCs w:val="18"/>
               </w:rPr>
-              <w:t xml:space="preserve">Switcher per widget instance, inline message or redirect</w:t>
+              <w:t xml:space="preserve">Double opt-in</w:t>
             </w:r>
           </w:p>
         </w:tc>
@@ -2580,7 +2694,7 @@
                 <w:sz w:val="18"/>
                 <w:szCs w:val="18"/>
               </w:rPr>
-              <w:t xml:space="preserve">Second widget</w:t>
+              <w:t xml:space="preserve">Spam protection</w:t>
             </w:r>
           </w:p>
         </w:tc>
@@ -2608,7 +2722,7 @@
                 <w:sz w:val="18"/>
                 <w:szCs w:val="18"/>
               </w:rPr>
-              <w:t xml:space="preserve">Newsletter archive of past sends</w:t>
+              <w:t xml:space="preserve">reCAPTCHA v3, invisible, plus a honeypot field</w:t>
             </w:r>
           </w:p>
         </w:tc>
@@ -2637,6 +2751,177 @@
                 <w:sz w:val="18"/>
                 <w:szCs w:val="18"/>
               </w:rPr>
+              <w:t xml:space="preserve">Consent checkbox</w:t>
+            </w:r>
+          </w:p>
+        </w:tc>
+        <w:tc>
+          <w:tcPr>
+            <w:tcW w:type="dxa" w:w="6126"/>
+            <w:tcMar>
+              <w:top w:type="dxa" w:w="90"/>
+              <w:left w:type="dxa" w:w="120"/>
+              <w:bottom w:type="dxa" w:w="90"/>
+              <w:right w:type="dxa" w:w="120"/>
+            </w:tcMar>
+          </w:tcPr>
+          <w:p>
+            <w:pPr>
+              <w:spacing w:after="0"/>
+            </w:pPr>
+            <w:r>
+              <w:rPr>
+                <w:rFonts w:ascii="Montserrat" w:cs="Montserrat" w:eastAsia="Montserrat" w:hAnsi="Montserrat"/>
+                <w:b w:val="false"/>
+                <w:bCs w:val="false"/>
+                <w:color w:val="111111"/>
+                <w:sz w:val="18"/>
+                <w:szCs w:val="18"/>
+              </w:rPr>
+              <w:t xml:space="preserve">None, consent implied by submitting, with metadata recorded</w:t>
+            </w:r>
+          </w:p>
+        </w:tc>
+      </w:tr>
+      <w:tr>
+        <w:tc>
+          <w:tcPr>
+            <w:tcW w:type="dxa" w:w="2900"/>
+            <w:shd w:fill="EDEFEE" w:color="auto" w:val="clear"/>
+            <w:tcMar>
+              <w:top w:type="dxa" w:w="90"/>
+              <w:left w:type="dxa" w:w="120"/>
+              <w:bottom w:type="dxa" w:w="90"/>
+              <w:right w:type="dxa" w:w="120"/>
+            </w:tcMar>
+          </w:tcPr>
+          <w:p>
+            <w:pPr>
+              <w:spacing w:after="0"/>
+            </w:pPr>
+            <w:r>
+              <w:rPr>
+                <w:rFonts w:ascii="Montserrat" w:cs="Montserrat" w:eastAsia="Montserrat" w:hAnsi="Montserrat"/>
+                <w:b w:val="false"/>
+                <w:bCs w:val="false"/>
+                <w:color w:val="111111"/>
+                <w:sz w:val="18"/>
+                <w:szCs w:val="18"/>
+              </w:rPr>
+              <w:t xml:space="preserve">Signup success behaviour</w:t>
+            </w:r>
+          </w:p>
+        </w:tc>
+        <w:tc>
+          <w:tcPr>
+            <w:tcW w:type="dxa" w:w="6126"/>
+            <w:shd w:fill="EDEFEE" w:color="auto" w:val="clear"/>
+            <w:tcMar>
+              <w:top w:type="dxa" w:w="90"/>
+              <w:left w:type="dxa" w:w="120"/>
+              <w:bottom w:type="dxa" w:w="90"/>
+              <w:right w:type="dxa" w:w="120"/>
+            </w:tcMar>
+          </w:tcPr>
+          <w:p>
+            <w:pPr>
+              <w:spacing w:after="0"/>
+            </w:pPr>
+            <w:r>
+              <w:rPr>
+                <w:rFonts w:ascii="Montserrat" w:cs="Montserrat" w:eastAsia="Montserrat" w:hAnsi="Montserrat"/>
+                <w:b w:val="false"/>
+                <w:bCs w:val="false"/>
+                <w:color w:val="111111"/>
+                <w:sz w:val="18"/>
+                <w:szCs w:val="18"/>
+              </w:rPr>
+              <w:t xml:space="preserve">Switcher per widget instance, inline message or redirect</w:t>
+            </w:r>
+          </w:p>
+        </w:tc>
+      </w:tr>
+      <w:tr>
+        <w:tc>
+          <w:tcPr>
+            <w:tcW w:type="dxa" w:w="2900"/>
+            <w:tcMar>
+              <w:top w:type="dxa" w:w="90"/>
+              <w:left w:type="dxa" w:w="120"/>
+              <w:bottom w:type="dxa" w:w="90"/>
+              <w:right w:type="dxa" w:w="120"/>
+            </w:tcMar>
+          </w:tcPr>
+          <w:p>
+            <w:pPr>
+              <w:spacing w:after="0"/>
+            </w:pPr>
+            <w:r>
+              <w:rPr>
+                <w:rFonts w:ascii="Montserrat" w:cs="Montserrat" w:eastAsia="Montserrat" w:hAnsi="Montserrat"/>
+                <w:b w:val="false"/>
+                <w:bCs w:val="false"/>
+                <w:color w:val="111111"/>
+                <w:sz w:val="18"/>
+                <w:szCs w:val="18"/>
+              </w:rPr>
+              <w:t xml:space="preserve">Second widget</w:t>
+            </w:r>
+          </w:p>
+        </w:tc>
+        <w:tc>
+          <w:tcPr>
+            <w:tcW w:type="dxa" w:w="6126"/>
+            <w:tcMar>
+              <w:top w:type="dxa" w:w="90"/>
+              <w:left w:type="dxa" w:w="120"/>
+              <w:bottom w:type="dxa" w:w="90"/>
+              <w:right w:type="dxa" w:w="120"/>
+            </w:tcMar>
+          </w:tcPr>
+          <w:p>
+            <w:pPr>
+              <w:spacing w:after="0"/>
+            </w:pPr>
+            <w:r>
+              <w:rPr>
+                <w:rFonts w:ascii="Montserrat" w:cs="Montserrat" w:eastAsia="Montserrat" w:hAnsi="Montserrat"/>
+                <w:b w:val="false"/>
+                <w:bCs w:val="false"/>
+                <w:color w:val="111111"/>
+                <w:sz w:val="18"/>
+                <w:szCs w:val="18"/>
+              </w:rPr>
+              <w:t xml:space="preserve">Newsletter archive of past sends</w:t>
+            </w:r>
+          </w:p>
+        </w:tc>
+      </w:tr>
+      <w:tr>
+        <w:tc>
+          <w:tcPr>
+            <w:tcW w:type="dxa" w:w="2900"/>
+            <w:shd w:fill="EDEFEE" w:color="auto" w:val="clear"/>
+            <w:tcMar>
+              <w:top w:type="dxa" w:w="90"/>
+              <w:left w:type="dxa" w:w="120"/>
+              <w:bottom w:type="dxa" w:w="90"/>
+              <w:right w:type="dxa" w:w="120"/>
+            </w:tcMar>
+          </w:tcPr>
+          <w:p>
+            <w:pPr>
+              <w:spacing w:after="0"/>
+            </w:pPr>
+            <w:r>
+              <w:rPr>
+                <w:rFonts w:ascii="Montserrat" w:cs="Montserrat" w:eastAsia="Montserrat" w:hAnsi="Montserrat"/>
+                <w:b w:val="false"/>
+                <w:bCs w:val="false"/>
+                <w:color w:val="111111"/>
+                <w:sz w:val="18"/>
+                <w:szCs w:val="18"/>
+              </w:rPr>
               <w:t xml:space="preserve">Send log</w:t>
             </w:r>
           </w:p>
@@ -2644,6 +2929,7 @@
         <w:tc>
           <w:tcPr>
             <w:tcW w:type="dxa" w:w="6126"/>
+            <w:shd w:fill="EDEFEE" w:color="auto" w:val="clear"/>
             <w:tcMar>
               <w:top w:type="dxa" w:w="90"/>
               <w:left w:type="dxa" w:w="120"/>
@@ -2880,7 +3166,7 @@
           <w:sz w:val="30"/>
           <w:szCs w:val="30"/>
         </w:rPr>
-        <w:t xml:space="preserve">5. Campaign Monitor prerequisites</w:t>
+        <w:t xml:space="preserve">5. Content structure on this site</w:t>
       </w:r>
     </w:p>
     <w:p>
@@ -2898,7 +3184,7 @@
           <w:sz w:val="20"/>
           <w:szCs w:val="20"/>
         </w:rPr>
-        <w:t xml:space="preserve">These are things that must exist inside Campaign Monitor before the plugin can do anything. They are your job, not the plugin’s, but the build depends on them.</w:t>
+        <w:t xml:space="preserve">This is the most important technical note in the brief, and the thing most likely to break the build if it is missed. Article content on this site does not live in post_content. It is stored in JetEngine fields, so anything that reads the post body must read those fields instead.</w:t>
       </w:r>
     </w:p>
     <w:p>
@@ -2915,47 +3201,703 @@
           <w:sz w:val="21"/>
           <w:szCs w:val="21"/>
         </w:rPr>
-        <w:t xml:space="preserve">Two templates</w:t>
-      </w:r>
-    </w:p>
-    <w:p>
-      <w:pPr>
-        <w:pStyle w:val="ListParagraph"/>
-        <w:numPr>
-          <w:ilvl w:val="0"/>
-          <w:numId w:val="3"/>
-        </w:numPr>
-        <w:spacing w:after="60"/>
-      </w:pPr>
-      <w:r>
-        <w:rPr>
-          <w:rFonts w:ascii="Montserrat" w:cs="Montserrat" w:eastAsia="Montserrat" w:hAnsi="Montserrat"/>
-          <w:color w:val="111111"/>
-          <w:sz w:val="20"/>
-          <w:szCs w:val="20"/>
-        </w:rPr>
-        <w:t xml:space="preserve">Single article template, with editable regions for: subject heading, article title, teaser text, category, author, read time, article link, CTA label, and one image region for the featured image.</w:t>
-      </w:r>
-    </w:p>
-    <w:p>
-      <w:pPr>
-        <w:pStyle w:val="ListParagraph"/>
-        <w:numPr>
-          <w:ilvl w:val="0"/>
-          <w:numId w:val="3"/>
-        </w:numPr>
-        <w:spacing w:after="60"/>
-      </w:pPr>
-      <w:r>
-        <w:rPr>
-          <w:rFonts w:ascii="Montserrat" w:cs="Montserrat" w:eastAsia="Montserrat" w:hAnsi="Montserrat"/>
-          <w:color w:val="111111"/>
-          <w:sz w:val="20"/>
-          <w:szCs w:val="20"/>
-        </w:rPr>
-        <w:t xml:space="preserve">Weekly digest template, containing a repeater region so that one block repeats per article, with the same fields inside each repeated block, plus an intro region for a short editorial line at the top.</w:t>
-      </w:r>
-    </w:p>
+        <w:t xml:space="preserve">The fields</w:t>
+      </w:r>
+    </w:p>
+    <w:tbl>
+      <w:tblPr>
+        <w:tblW w:type="dxa" w:w="9026"/>
+        <w:tblBorders>
+          <w:top w:val="single" w:color="CCCFCE" w:sz="2"/>
+          <w:left w:val="single" w:color="CCCFCE" w:sz="2"/>
+          <w:bottom w:val="single" w:color="CCCFCE" w:sz="2"/>
+          <w:right w:val="single" w:color="CCCFCE" w:sz="2"/>
+          <w:insideH w:val="single" w:color="CCCFCE" w:sz="2"/>
+          <w:insideV w:val="single" w:color="CCCFCE" w:sz="2"/>
+        </w:tblBorders>
+      </w:tblPr>
+      <w:tblGrid>
+        <w:gridCol w:w="1900"/>
+        <w:gridCol w:w="2400"/>
+        <w:gridCol w:w="2100"/>
+        <w:gridCol w:w="2626"/>
+      </w:tblGrid>
+      <w:tr>
+        <w:trPr>
+          <w:tblHeader/>
+        </w:trPr>
+        <w:tc>
+          <w:tcPr>
+            <w:tcW w:type="dxa" w:w="1900"/>
+            <w:shd w:fill="1B3A2F" w:color="auto" w:val="clear"/>
+            <w:tcMar>
+              <w:top w:type="dxa" w:w="90"/>
+              <w:left w:type="dxa" w:w="120"/>
+              <w:bottom w:type="dxa" w:w="90"/>
+              <w:right w:type="dxa" w:w="120"/>
+            </w:tcMar>
+          </w:tcPr>
+          <w:p>
+            <w:pPr>
+              <w:spacing w:after="0"/>
+            </w:pPr>
+            <w:r>
+              <w:rPr>
+                <w:rFonts w:ascii="Montserrat" w:cs="Montserrat" w:eastAsia="Montserrat" w:hAnsi="Montserrat"/>
+                <w:b/>
+                <w:bCs/>
+                <w:color w:val="FFFFFF"/>
+                <w:sz w:val="18"/>
+                <w:szCs w:val="18"/>
+              </w:rPr>
+              <w:t xml:space="preserve">Field</w:t>
+            </w:r>
+          </w:p>
+        </w:tc>
+        <w:tc>
+          <w:tcPr>
+            <w:tcW w:type="dxa" w:w="2400"/>
+            <w:shd w:fill="1B3A2F" w:color="auto" w:val="clear"/>
+            <w:tcMar>
+              <w:top w:type="dxa" w:w="90"/>
+              <w:left w:type="dxa" w:w="120"/>
+              <w:bottom w:type="dxa" w:w="90"/>
+              <w:right w:type="dxa" w:w="120"/>
+            </w:tcMar>
+          </w:tcPr>
+          <w:p>
+            <w:pPr>
+              <w:spacing w:after="0"/>
+            </w:pPr>
+            <w:r>
+              <w:rPr>
+                <w:rFonts w:ascii="Montserrat" w:cs="Montserrat" w:eastAsia="Montserrat" w:hAnsi="Montserrat"/>
+                <w:b/>
+                <w:bCs/>
+                <w:color w:val="FFFFFF"/>
+                <w:sz w:val="18"/>
+                <w:szCs w:val="18"/>
+              </w:rPr>
+              <w:t xml:space="preserve">Meta key</w:t>
+            </w:r>
+          </w:p>
+        </w:tc>
+        <w:tc>
+          <w:tcPr>
+            <w:tcW w:type="dxa" w:w="2100"/>
+            <w:shd w:fill="1B3A2F" w:color="auto" w:val="clear"/>
+            <w:tcMar>
+              <w:top w:type="dxa" w:w="90"/>
+              <w:left w:type="dxa" w:w="120"/>
+              <w:bottom w:type="dxa" w:w="90"/>
+              <w:right w:type="dxa" w:w="120"/>
+            </w:tcMar>
+          </w:tcPr>
+          <w:p>
+            <w:pPr>
+              <w:spacing w:after="0"/>
+            </w:pPr>
+            <w:r>
+              <w:rPr>
+                <w:rFonts w:ascii="Montserrat" w:cs="Montserrat" w:eastAsia="Montserrat" w:hAnsi="Montserrat"/>
+                <w:b/>
+                <w:bCs/>
+                <w:color w:val="FFFFFF"/>
+                <w:sz w:val="18"/>
+                <w:szCs w:val="18"/>
+              </w:rPr>
+              <w:t xml:space="preserve">Type</w:t>
+            </w:r>
+          </w:p>
+        </w:tc>
+        <w:tc>
+          <w:tcPr>
+            <w:tcW w:type="dxa" w:w="2626"/>
+            <w:shd w:fill="1B3A2F" w:color="auto" w:val="clear"/>
+            <w:tcMar>
+              <w:top w:type="dxa" w:w="90"/>
+              <w:left w:type="dxa" w:w="120"/>
+              <w:bottom w:type="dxa" w:w="90"/>
+              <w:right w:type="dxa" w:w="120"/>
+            </w:tcMar>
+          </w:tcPr>
+          <w:p>
+            <w:pPr>
+              <w:spacing w:after="0"/>
+            </w:pPr>
+            <w:r>
+              <w:rPr>
+                <w:rFonts w:ascii="Montserrat" w:cs="Montserrat" w:eastAsia="Montserrat" w:hAnsi="Montserrat"/>
+                <w:b/>
+                <w:bCs/>
+                <w:color w:val="FFFFFF"/>
+                <w:sz w:val="18"/>
+                <w:szCs w:val="18"/>
+              </w:rPr>
+              <w:t xml:space="preserve">Used for</w:t>
+            </w:r>
+          </w:p>
+        </w:tc>
+      </w:tr>
+      <w:tr>
+        <w:tc>
+          <w:tcPr>
+            <w:tcW w:type="dxa" w:w="1900"/>
+            <w:tcMar>
+              <w:top w:type="dxa" w:w="90"/>
+              <w:left w:type="dxa" w:w="120"/>
+              <w:bottom w:type="dxa" w:w="90"/>
+              <w:right w:type="dxa" w:w="120"/>
+            </w:tcMar>
+          </w:tcPr>
+          <w:p>
+            <w:pPr>
+              <w:spacing w:after="0"/>
+            </w:pPr>
+            <w:r>
+              <w:rPr>
+                <w:rFonts w:ascii="Montserrat" w:cs="Montserrat" w:eastAsia="Montserrat" w:hAnsi="Montserrat"/>
+                <w:b w:val="false"/>
+                <w:bCs w:val="false"/>
+                <w:color w:val="111111"/>
+                <w:sz w:val="18"/>
+                <w:szCs w:val="18"/>
+              </w:rPr>
+              <w:t xml:space="preserve">Intro</w:t>
+            </w:r>
+          </w:p>
+        </w:tc>
+        <w:tc>
+          <w:tcPr>
+            <w:tcW w:type="dxa" w:w="2400"/>
+            <w:tcMar>
+              <w:top w:type="dxa" w:w="90"/>
+              <w:left w:type="dxa" w:w="120"/>
+              <w:bottom w:type="dxa" w:w="90"/>
+              <w:right w:type="dxa" w:w="120"/>
+            </w:tcMar>
+          </w:tcPr>
+          <w:p>
+            <w:pPr>
+              <w:spacing w:after="0"/>
+            </w:pPr>
+            <w:r>
+              <w:rPr>
+                <w:rFonts w:ascii="Montserrat" w:cs="Montserrat" w:eastAsia="Montserrat" w:hAnsi="Montserrat"/>
+                <w:b w:val="false"/>
+                <w:bCs w:val="false"/>
+                <w:color w:val="111111"/>
+                <w:sz w:val="18"/>
+                <w:szCs w:val="18"/>
+              </w:rPr>
+              <w:t xml:space="preserve">Selected in settings</w:t>
+            </w:r>
+          </w:p>
+        </w:tc>
+        <w:tc>
+          <w:tcPr>
+            <w:tcW w:type="dxa" w:w="2100"/>
+            <w:tcMar>
+              <w:top w:type="dxa" w:w="90"/>
+              <w:left w:type="dxa" w:w="120"/>
+              <w:bottom w:type="dxa" w:w="90"/>
+              <w:right w:type="dxa" w:w="120"/>
+            </w:tcMar>
+          </w:tcPr>
+          <w:p>
+            <w:pPr>
+              <w:spacing w:after="0"/>
+            </w:pPr>
+            <w:r>
+              <w:rPr>
+                <w:rFonts w:ascii="Montserrat" w:cs="Montserrat" w:eastAsia="Montserrat" w:hAnsi="Montserrat"/>
+                <w:b w:val="false"/>
+                <w:bCs w:val="false"/>
+                <w:color w:val="111111"/>
+                <w:sz w:val="18"/>
+                <w:szCs w:val="18"/>
+              </w:rPr>
+              <w:t xml:space="preserve">Text</w:t>
+            </w:r>
+          </w:p>
+        </w:tc>
+        <w:tc>
+          <w:tcPr>
+            <w:tcW w:type="dxa" w:w="2626"/>
+            <w:tcMar>
+              <w:top w:type="dxa" w:w="90"/>
+              <w:left w:type="dxa" w:w="120"/>
+              <w:bottom w:type="dxa" w:w="90"/>
+              <w:right w:type="dxa" w:w="120"/>
+            </w:tcMar>
+          </w:tcPr>
+          <w:p>
+            <w:pPr>
+              <w:spacing w:after="0"/>
+            </w:pPr>
+            <w:r>
+              <w:rPr>
+                <w:rFonts w:ascii="Montserrat" w:cs="Montserrat" w:eastAsia="Montserrat" w:hAnsi="Montserrat"/>
+                <w:b w:val="false"/>
+                <w:bCs w:val="false"/>
+                <w:color w:val="111111"/>
+                <w:sz w:val="18"/>
+                <w:szCs w:val="18"/>
+              </w:rPr>
+              <w:t xml:space="preserve">Primary teaser source</w:t>
+            </w:r>
+          </w:p>
+        </w:tc>
+      </w:tr>
+      <w:tr>
+        <w:tc>
+          <w:tcPr>
+            <w:tcW w:type="dxa" w:w="1900"/>
+            <w:shd w:fill="EDEFEE" w:color="auto" w:val="clear"/>
+            <w:tcMar>
+              <w:top w:type="dxa" w:w="90"/>
+              <w:left w:type="dxa" w:w="120"/>
+              <w:bottom w:type="dxa" w:w="90"/>
+              <w:right w:type="dxa" w:w="120"/>
+            </w:tcMar>
+          </w:tcPr>
+          <w:p>
+            <w:pPr>
+              <w:spacing w:after="0"/>
+            </w:pPr>
+            <w:r>
+              <w:rPr>
+                <w:rFonts w:ascii="Montserrat" w:cs="Montserrat" w:eastAsia="Montserrat" w:hAnsi="Montserrat"/>
+                <w:b w:val="false"/>
+                <w:bCs w:val="false"/>
+                <w:color w:val="111111"/>
+                <w:sz w:val="18"/>
+                <w:szCs w:val="18"/>
+              </w:rPr>
+              <w:t xml:space="preserve">Article Sections</w:t>
+            </w:r>
+          </w:p>
+        </w:tc>
+        <w:tc>
+          <w:tcPr>
+            <w:tcW w:type="dxa" w:w="2400"/>
+            <w:shd w:fill="EDEFEE" w:color="auto" w:val="clear"/>
+            <w:tcMar>
+              <w:top w:type="dxa" w:w="90"/>
+              <w:left w:type="dxa" w:w="120"/>
+              <w:bottom w:type="dxa" w:w="90"/>
+              <w:right w:type="dxa" w:w="120"/>
+            </w:tcMar>
+          </w:tcPr>
+          <w:p>
+            <w:pPr>
+              <w:spacing w:after="0"/>
+            </w:pPr>
+            <w:r>
+              <w:rPr>
+                <w:rFonts w:ascii="Montserrat" w:cs="Montserrat" w:eastAsia="Montserrat" w:hAnsi="Montserrat"/>
+                <w:b w:val="false"/>
+                <w:bCs w:val="false"/>
+                <w:color w:val="111111"/>
+                <w:sz w:val="18"/>
+                <w:szCs w:val="18"/>
+              </w:rPr>
+              <w:t xml:space="preserve">article_sections</w:t>
+            </w:r>
+          </w:p>
+        </w:tc>
+        <w:tc>
+          <w:tcPr>
+            <w:tcW w:type="dxa" w:w="2100"/>
+            <w:shd w:fill="EDEFEE" w:color="auto" w:val="clear"/>
+            <w:tcMar>
+              <w:top w:type="dxa" w:w="90"/>
+              <w:left w:type="dxa" w:w="120"/>
+              <w:bottom w:type="dxa" w:w="90"/>
+              <w:right w:type="dxa" w:w="120"/>
+            </w:tcMar>
+          </w:tcPr>
+          <w:p>
+            <w:pPr>
+              <w:spacing w:after="0"/>
+            </w:pPr>
+            <w:r>
+              <w:rPr>
+                <w:rFonts w:ascii="Montserrat" w:cs="Montserrat" w:eastAsia="Montserrat" w:hAnsi="Montserrat"/>
+                <w:b w:val="false"/>
+                <w:bCs w:val="false"/>
+                <w:color w:val="111111"/>
+                <w:sz w:val="18"/>
+                <w:szCs w:val="18"/>
+              </w:rPr>
+              <w:t xml:space="preserve">Repeater</w:t>
+            </w:r>
+          </w:p>
+        </w:tc>
+        <w:tc>
+          <w:tcPr>
+            <w:tcW w:type="dxa" w:w="2626"/>
+            <w:shd w:fill="EDEFEE" w:color="auto" w:val="clear"/>
+            <w:tcMar>
+              <w:top w:type="dxa" w:w="90"/>
+              <w:left w:type="dxa" w:w="120"/>
+              <w:bottom w:type="dxa" w:w="90"/>
+              <w:right w:type="dxa" w:w="120"/>
+            </w:tcMar>
+          </w:tcPr>
+          <w:p>
+            <w:pPr>
+              <w:spacing w:after="0"/>
+            </w:pPr>
+            <w:r>
+              <w:rPr>
+                <w:rFonts w:ascii="Montserrat" w:cs="Montserrat" w:eastAsia="Montserrat" w:hAnsi="Montserrat"/>
+                <w:b w:val="false"/>
+                <w:bCs w:val="false"/>
+                <w:color w:val="111111"/>
+                <w:sz w:val="18"/>
+                <w:szCs w:val="18"/>
+              </w:rPr>
+              <w:t xml:space="preserve">The article body, one row per section</w:t>
+            </w:r>
+          </w:p>
+        </w:tc>
+      </w:tr>
+      <w:tr>
+        <w:tc>
+          <w:tcPr>
+            <w:tcW w:type="dxa" w:w="1900"/>
+            <w:tcMar>
+              <w:top w:type="dxa" w:w="90"/>
+              <w:left w:type="dxa" w:w="120"/>
+              <w:bottom w:type="dxa" w:w="90"/>
+              <w:right w:type="dxa" w:w="120"/>
+            </w:tcMar>
+          </w:tcPr>
+          <w:p>
+            <w:pPr>
+              <w:spacing w:after="0"/>
+            </w:pPr>
+            <w:r>
+              <w:rPr>
+                <w:rFonts w:ascii="Montserrat" w:cs="Montserrat" w:eastAsia="Montserrat" w:hAnsi="Montserrat"/>
+                <w:b w:val="false"/>
+                <w:bCs w:val="false"/>
+                <w:color w:val="111111"/>
+                <w:sz w:val="18"/>
+                <w:szCs w:val="18"/>
+              </w:rPr>
+              <w:t xml:space="preserve">Heading</w:t>
+            </w:r>
+          </w:p>
+        </w:tc>
+        <w:tc>
+          <w:tcPr>
+            <w:tcW w:type="dxa" w:w="2400"/>
+            <w:tcMar>
+              <w:top w:type="dxa" w:w="90"/>
+              <w:left w:type="dxa" w:w="120"/>
+              <w:bottom w:type="dxa" w:w="90"/>
+              <w:right w:type="dxa" w:w="120"/>
+            </w:tcMar>
+          </w:tcPr>
+          <w:p>
+            <w:pPr>
+              <w:spacing w:after="0"/>
+            </w:pPr>
+            <w:r>
+              <w:rPr>
+                <w:rFonts w:ascii="Montserrat" w:cs="Montserrat" w:eastAsia="Montserrat" w:hAnsi="Montserrat"/>
+                <w:b w:val="false"/>
+                <w:bCs w:val="false"/>
+                <w:color w:val="111111"/>
+                <w:sz w:val="18"/>
+                <w:szCs w:val="18"/>
+              </w:rPr>
+              <w:t xml:space="preserve">section_heading</w:t>
+            </w:r>
+          </w:p>
+        </w:tc>
+        <w:tc>
+          <w:tcPr>
+            <w:tcW w:type="dxa" w:w="2100"/>
+            <w:tcMar>
+              <w:top w:type="dxa" w:w="90"/>
+              <w:left w:type="dxa" w:w="120"/>
+              <w:bottom w:type="dxa" w:w="90"/>
+              <w:right w:type="dxa" w:w="120"/>
+            </w:tcMar>
+          </w:tcPr>
+          <w:p>
+            <w:pPr>
+              <w:spacing w:after="0"/>
+            </w:pPr>
+            <w:r>
+              <w:rPr>
+                <w:rFonts w:ascii="Montserrat" w:cs="Montserrat" w:eastAsia="Montserrat" w:hAnsi="Montserrat"/>
+                <w:b w:val="false"/>
+                <w:bCs w:val="false"/>
+                <w:color w:val="111111"/>
+                <w:sz w:val="18"/>
+                <w:szCs w:val="18"/>
+              </w:rPr>
+              <w:t xml:space="preserve">Text, per row</w:t>
+            </w:r>
+          </w:p>
+        </w:tc>
+        <w:tc>
+          <w:tcPr>
+            <w:tcW w:type="dxa" w:w="2626"/>
+            <w:tcMar>
+              <w:top w:type="dxa" w:w="90"/>
+              <w:left w:type="dxa" w:w="120"/>
+              <w:bottom w:type="dxa" w:w="90"/>
+              <w:right w:type="dxa" w:w="120"/>
+            </w:tcMar>
+          </w:tcPr>
+          <w:p>
+            <w:pPr>
+              <w:spacing w:after="0"/>
+            </w:pPr>
+            <w:r>
+              <w:rPr>
+                <w:rFonts w:ascii="Montserrat" w:cs="Montserrat" w:eastAsia="Montserrat" w:hAnsi="Montserrat"/>
+                <w:b w:val="false"/>
+                <w:bCs w:val="false"/>
+                <w:color w:val="111111"/>
+                <w:sz w:val="18"/>
+                <w:szCs w:val="18"/>
+              </w:rPr>
+              <w:t xml:space="preserve">Optional preview text source</w:t>
+            </w:r>
+          </w:p>
+        </w:tc>
+      </w:tr>
+      <w:tr>
+        <w:tc>
+          <w:tcPr>
+            <w:tcW w:type="dxa" w:w="1900"/>
+            <w:shd w:fill="EDEFEE" w:color="auto" w:val="clear"/>
+            <w:tcMar>
+              <w:top w:type="dxa" w:w="90"/>
+              <w:left w:type="dxa" w:w="120"/>
+              <w:bottom w:type="dxa" w:w="90"/>
+              <w:right w:type="dxa" w:w="120"/>
+            </w:tcMar>
+          </w:tcPr>
+          <w:p>
+            <w:pPr>
+              <w:spacing w:after="0"/>
+            </w:pPr>
+            <w:r>
+              <w:rPr>
+                <w:rFonts w:ascii="Montserrat" w:cs="Montserrat" w:eastAsia="Montserrat" w:hAnsi="Montserrat"/>
+                <w:b w:val="false"/>
+                <w:bCs w:val="false"/>
+                <w:color w:val="111111"/>
+                <w:sz w:val="18"/>
+                <w:szCs w:val="18"/>
+              </w:rPr>
+              <w:t xml:space="preserve">Bodycopy</w:t>
+            </w:r>
+          </w:p>
+        </w:tc>
+        <w:tc>
+          <w:tcPr>
+            <w:tcW w:type="dxa" w:w="2400"/>
+            <w:shd w:fill="EDEFEE" w:color="auto" w:val="clear"/>
+            <w:tcMar>
+              <w:top w:type="dxa" w:w="90"/>
+              <w:left w:type="dxa" w:w="120"/>
+              <w:bottom w:type="dxa" w:w="90"/>
+              <w:right w:type="dxa" w:w="120"/>
+            </w:tcMar>
+          </w:tcPr>
+          <w:p>
+            <w:pPr>
+              <w:spacing w:after="0"/>
+            </w:pPr>
+            <w:r>
+              <w:rPr>
+                <w:rFonts w:ascii="Montserrat" w:cs="Montserrat" w:eastAsia="Montserrat" w:hAnsi="Montserrat"/>
+                <w:b w:val="false"/>
+                <w:bCs w:val="false"/>
+                <w:color w:val="111111"/>
+                <w:sz w:val="18"/>
+                <w:szCs w:val="18"/>
+              </w:rPr>
+              <w:t xml:space="preserve">section_bodycopy</w:t>
+            </w:r>
+          </w:p>
+        </w:tc>
+        <w:tc>
+          <w:tcPr>
+            <w:tcW w:type="dxa" w:w="2100"/>
+            <w:shd w:fill="EDEFEE" w:color="auto" w:val="clear"/>
+            <w:tcMar>
+              <w:top w:type="dxa" w:w="90"/>
+              <w:left w:type="dxa" w:w="120"/>
+              <w:bottom w:type="dxa" w:w="90"/>
+              <w:right w:type="dxa" w:w="120"/>
+            </w:tcMar>
+          </w:tcPr>
+          <w:p>
+            <w:pPr>
+              <w:spacing w:after="0"/>
+            </w:pPr>
+            <w:r>
+              <w:rPr>
+                <w:rFonts w:ascii="Montserrat" w:cs="Montserrat" w:eastAsia="Montserrat" w:hAnsi="Montserrat"/>
+                <w:b w:val="false"/>
+                <w:bCs w:val="false"/>
+                <w:color w:val="111111"/>
+                <w:sz w:val="18"/>
+                <w:szCs w:val="18"/>
+              </w:rPr>
+              <w:t xml:space="preserve">WYSIWYG, per row</w:t>
+            </w:r>
+          </w:p>
+        </w:tc>
+        <w:tc>
+          <w:tcPr>
+            <w:tcW w:type="dxa" w:w="2626"/>
+            <w:shd w:fill="EDEFEE" w:color="auto" w:val="clear"/>
+            <w:tcMar>
+              <w:top w:type="dxa" w:w="90"/>
+              <w:left w:type="dxa" w:w="120"/>
+              <w:bottom w:type="dxa" w:w="90"/>
+              <w:right w:type="dxa" w:w="120"/>
+            </w:tcMar>
+          </w:tcPr>
+          <w:p>
+            <w:pPr>
+              <w:spacing w:after="0"/>
+            </w:pPr>
+            <w:r>
+              <w:rPr>
+                <w:rFonts w:ascii="Montserrat" w:cs="Montserrat" w:eastAsia="Montserrat" w:hAnsi="Montserrat"/>
+                <w:b w:val="false"/>
+                <w:bCs w:val="false"/>
+                <w:color w:val="111111"/>
+                <w:sz w:val="18"/>
+                <w:szCs w:val="18"/>
+              </w:rPr>
+              <w:t xml:space="preserve">Secondary teaser source</w:t>
+            </w:r>
+          </w:p>
+        </w:tc>
+      </w:tr>
+      <w:tr>
+        <w:tc>
+          <w:tcPr>
+            <w:tcW w:type="dxa" w:w="1900"/>
+            <w:tcMar>
+              <w:top w:type="dxa" w:w="90"/>
+              <w:left w:type="dxa" w:w="120"/>
+              <w:bottom w:type="dxa" w:w="90"/>
+              <w:right w:type="dxa" w:w="120"/>
+            </w:tcMar>
+          </w:tcPr>
+          <w:p>
+            <w:pPr>
+              <w:spacing w:after="0"/>
+            </w:pPr>
+            <w:r>
+              <w:rPr>
+                <w:rFonts w:ascii="Montserrat" w:cs="Montserrat" w:eastAsia="Montserrat" w:hAnsi="Montserrat"/>
+                <w:b w:val="false"/>
+                <w:bCs w:val="false"/>
+                <w:color w:val="111111"/>
+                <w:sz w:val="18"/>
+                <w:szCs w:val="18"/>
+              </w:rPr>
+              <w:t xml:space="preserve">Section Image</w:t>
+            </w:r>
+          </w:p>
+        </w:tc>
+        <w:tc>
+          <w:tcPr>
+            <w:tcW w:type="dxa" w:w="2400"/>
+            <w:tcMar>
+              <w:top w:type="dxa" w:w="90"/>
+              <w:left w:type="dxa" w:w="120"/>
+              <w:bottom w:type="dxa" w:w="90"/>
+              <w:right w:type="dxa" w:w="120"/>
+            </w:tcMar>
+          </w:tcPr>
+          <w:p>
+            <w:pPr>
+              <w:spacing w:after="0"/>
+            </w:pPr>
+            <w:r>
+              <w:rPr>
+                <w:rFonts w:ascii="Montserrat" w:cs="Montserrat" w:eastAsia="Montserrat" w:hAnsi="Montserrat"/>
+                <w:b w:val="false"/>
+                <w:bCs w:val="false"/>
+                <w:color w:val="111111"/>
+                <w:sz w:val="18"/>
+                <w:szCs w:val="18"/>
+              </w:rPr>
+              <w:t xml:space="preserve">section_image</w:t>
+            </w:r>
+          </w:p>
+        </w:tc>
+        <w:tc>
+          <w:tcPr>
+            <w:tcW w:type="dxa" w:w="2100"/>
+            <w:tcMar>
+              <w:top w:type="dxa" w:w="90"/>
+              <w:left w:type="dxa" w:w="120"/>
+              <w:bottom w:type="dxa" w:w="90"/>
+              <w:right w:type="dxa" w:w="120"/>
+            </w:tcMar>
+          </w:tcPr>
+          <w:p>
+            <w:pPr>
+              <w:spacing w:after="0"/>
+            </w:pPr>
+            <w:r>
+              <w:rPr>
+                <w:rFonts w:ascii="Montserrat" w:cs="Montserrat" w:eastAsia="Montserrat" w:hAnsi="Montserrat"/>
+                <w:b w:val="false"/>
+                <w:bCs w:val="false"/>
+                <w:color w:val="111111"/>
+                <w:sz w:val="18"/>
+                <w:szCs w:val="18"/>
+              </w:rPr>
+              <w:t xml:space="preserve">Media, per row</w:t>
+            </w:r>
+          </w:p>
+        </w:tc>
+        <w:tc>
+          <w:tcPr>
+            <w:tcW w:type="dxa" w:w="2626"/>
+            <w:tcMar>
+              <w:top w:type="dxa" w:w="90"/>
+              <w:left w:type="dxa" w:w="120"/>
+              <w:bottom w:type="dxa" w:w="90"/>
+              <w:right w:type="dxa" w:w="120"/>
+            </w:tcMar>
+          </w:tcPr>
+          <w:p>
+            <w:pPr>
+              <w:spacing w:after="0"/>
+            </w:pPr>
+            <w:r>
+              <w:rPr>
+                <w:rFonts w:ascii="Montserrat" w:cs="Montserrat" w:eastAsia="Montserrat" w:hAnsi="Montserrat"/>
+                <w:b w:val="false"/>
+                <w:bCs w:val="false"/>
+                <w:color w:val="111111"/>
+                <w:sz w:val="18"/>
+                <w:szCs w:val="18"/>
+              </w:rPr>
+              <w:t xml:space="preserve">Featured image fallback</w:t>
+            </w:r>
+          </w:p>
+        </w:tc>
+      </w:tr>
+    </w:tbl>
     <w:p>
       <w:pPr>
         <w:spacing w:after="80"/>
@@ -2965,24 +3907,6 @@
           <w:rFonts w:ascii="Montserrat" w:cs="Montserrat" w:eastAsia="Montserrat" w:hAnsi="Montserrat"/>
         </w:rPr>
         <w:t xml:space="preserve"/>
-      </w:r>
-    </w:p>
-    <w:p>
-      <w:pPr>
-        <w:spacing w:after="120"/>
-      </w:pPr>
-      <w:r>
-        <w:rPr>
-          <w:rFonts w:ascii="Montserrat" w:cs="Montserrat" w:eastAsia="Montserrat" w:hAnsi="Montserrat"/>
-          <w:b w:val="false"/>
-          <w:bCs w:val="false"/>
-          <w:i/>
-          <w:iCs/>
-          <w:color w:val="111111"/>
-          <w:sz w:val="20"/>
-          <w:szCs w:val="20"/>
-        </w:rPr>
-        <w:t xml:space="preserve">Campaign Monitor requires a single-click unsubscribe link in every campaign, so both templates must contain an unsubscribe tag. A template without one will be rejected by the API.</w:t>
       </w:r>
     </w:p>
     <w:p>
@@ -2999,102 +3923,131 @@
           <w:sz w:val="21"/>
           <w:szCs w:val="21"/>
         </w:rPr>
-        <w:t xml:space="preserve">Other prerequisites</w:t>
-      </w:r>
-    </w:p>
-    <w:p>
-      <w:pPr>
-        <w:pStyle w:val="ListParagraph"/>
-        <w:numPr>
-          <w:ilvl w:val="0"/>
-          <w:numId w:val="3"/>
-        </w:numPr>
-        <w:spacing w:after="60"/>
-      </w:pPr>
-      <w:r>
-        <w:rPr>
-          <w:rFonts w:ascii="Montserrat" w:cs="Montserrat" w:eastAsia="Montserrat" w:hAnsi="Montserrat"/>
-          <w:color w:val="111111"/>
-          <w:sz w:val="20"/>
-          <w:szCs w:val="20"/>
-        </w:rPr>
-        <w:t xml:space="preserve">API key for the account, with permission to create and send campaigns and to import subscribers.</w:t>
-      </w:r>
-    </w:p>
-    <w:p>
-      <w:pPr>
-        <w:pStyle w:val="ListParagraph"/>
-        <w:numPr>
-          <w:ilvl w:val="0"/>
-          <w:numId w:val="3"/>
-        </w:numPr>
-        <w:spacing w:after="60"/>
-      </w:pPr>
-      <w:r>
-        <w:rPr>
-          <w:rFonts w:ascii="Montserrat" w:cs="Montserrat" w:eastAsia="Montserrat" w:hAnsi="Montserrat"/>
-          <w:color w:val="111111"/>
-          <w:sz w:val="20"/>
-          <w:szCs w:val="20"/>
-        </w:rPr>
-        <w:t xml:space="preserve">A verified from address for the client this site belongs to.</w:t>
-      </w:r>
-    </w:p>
-    <w:p>
-      <w:pPr>
-        <w:pStyle w:val="ListParagraph"/>
-        <w:numPr>
-          <w:ilvl w:val="0"/>
-          <w:numId w:val="3"/>
-        </w:numPr>
-        <w:spacing w:after="60"/>
-      </w:pPr>
-      <w:r>
-        <w:rPr>
-          <w:rFonts w:ascii="Montserrat" w:cs="Montserrat" w:eastAsia="Montserrat" w:hAnsi="Montserrat"/>
-          <w:color w:val="111111"/>
-          <w:sz w:val="20"/>
-          <w:szCs w:val="20"/>
-        </w:rPr>
-        <w:t xml:space="preserve">The subscriber list this site sends to, with custom fields created for the consent metadata: signup date, signup IP and signup page.</w:t>
-      </w:r>
-    </w:p>
-    <w:p>
-      <w:pPr>
-        <w:pStyle w:val="ListParagraph"/>
-        <w:numPr>
-          <w:ilvl w:val="0"/>
-          <w:numId w:val="3"/>
-        </w:numPr>
-        <w:spacing w:after="60"/>
-      </w:pPr>
-      <w:r>
-        <w:rPr>
-          <w:rFonts w:ascii="Montserrat" w:cs="Montserrat" w:eastAsia="Montserrat" w:hAnsi="Montserrat"/>
-          <w:color w:val="111111"/>
-          <w:sz w:val="20"/>
-          <w:szCs w:val="20"/>
-        </w:rPr>
-        <w:t xml:space="preserve">A designed confirmation email for double opt-in, since new subscribers will receive it before they are added.</w:t>
-      </w:r>
-    </w:p>
-    <w:p>
-      <w:pPr>
-        <w:pStyle w:val="ListParagraph"/>
-        <w:numPr>
-          <w:ilvl w:val="0"/>
-          <w:numId w:val="3"/>
-        </w:numPr>
-        <w:spacing w:after="60"/>
-      </w:pPr>
-      <w:r>
-        <w:rPr>
-          <w:rFonts w:ascii="Montserrat" w:cs="Montserrat" w:eastAsia="Montserrat" w:hAnsi="Montserrat"/>
-          <w:color w:val="111111"/>
-          <w:sz w:val="20"/>
-          <w:szCs w:val="20"/>
-        </w:rPr>
-        <w:t xml:space="preserve">Google reCAPTCHA v3 site key and secret key for the domain.</w:t>
+        <w:t xml:space="preserve">How the plugin reads it</w:t>
+      </w:r>
+    </w:p>
+    <w:p>
+      <w:pPr>
+        <w:spacing w:after="120"/>
+      </w:pPr>
+      <w:r>
+        <w:rPr>
+          <w:rFonts w:ascii="Montserrat" w:cs="Montserrat" w:eastAsia="Montserrat" w:hAnsi="Montserrat"/>
+          <w:b w:val="false"/>
+          <w:bCs w:val="false"/>
+          <w:i w:val="false"/>
+          <w:iCs w:val="false"/>
+          <w:color w:val="111111"/>
+          <w:sz w:val="20"/>
+          <w:szCs w:val="20"/>
+        </w:rPr>
+        <w:t xml:space="preserve">JetEngine stores a repeater as a single JSON string in one meta key. The plugin decodes that string into rows and walks them in stored order, which is the order they appear in the editor, so sequence is never a concern. Reading the raw meta value as text would count the field structure itself as words and produce nonsense, so decoding is mandatory.</w:t>
+      </w:r>
+    </w:p>
+    <w:p>
+      <w:pPr>
+        <w:spacing w:after="120"/>
+      </w:pPr>
+      <w:r>
+        <w:rPr>
+          <w:rFonts w:ascii="Montserrat" w:cs="Montserrat" w:eastAsia="Montserrat" w:hAnsi="Montserrat"/>
+          <w:b w:val="false"/>
+          <w:bCs w:val="false"/>
+          <w:i w:val="false"/>
+          <w:iCs w:val="false"/>
+          <w:color w:val="111111"/>
+          <w:sz w:val="20"/>
+          <w:szCs w:val="20"/>
+        </w:rPr>
+        <w:t xml:space="preserve">For the teaser, the plugin starts with the intro field. If the intro already meets the configured word count, it stops there. If not, it continues into the first repeater row body copy until the count is met. Every article therefore leads with the copy that was written to hook the reader.</w:t>
+      </w:r>
+    </w:p>
+    <w:p>
+      <w:pPr>
+        <w:spacing w:after="120"/>
+      </w:pPr>
+      <w:r>
+        <w:rPr>
+          <w:rFonts w:ascii="Montserrat" w:cs="Montserrat" w:eastAsia="Montserrat" w:hAnsi="Montserrat"/>
+          <w:b w:val="false"/>
+          <w:bCs w:val="false"/>
+          <w:i w:val="false"/>
+          <w:iCs w:val="false"/>
+          <w:color w:val="111111"/>
+          <w:sz w:val="20"/>
+          <w:szCs w:val="20"/>
+        </w:rPr>
+        <w:t xml:space="preserve">The body copy field is a WYSIWYG, so it stores HTML. Tags, shortcodes, embeds and captions are stripped before the text is used. Registered trademark symbols, curly quotes and apostrophes are converted to HTML entities, since these are the characters that most often arrive in an inbox as garbled text, particularly in Outlook.</w:t>
+      </w:r>
+    </w:p>
+    <w:p>
+      <w:pPr>
+        <w:pStyle w:val="Heading3"/>
+        <w:spacing w:after="100" w:before="200"/>
+      </w:pPr>
+      <w:r>
+        <w:rPr>
+          <w:rFonts w:ascii="Montserrat" w:cs="Montserrat" w:eastAsia="Montserrat" w:hAnsi="Montserrat"/>
+          <w:b/>
+          <w:bCs/>
+          <w:color w:val="2E5C4A"/>
+          <w:sz w:val="21"/>
+          <w:szCs w:val="21"/>
+        </w:rPr>
+        <w:t xml:space="preserve">Field mapping is configurable, not hard-coded</w:t>
+      </w:r>
+    </w:p>
+    <w:p>
+      <w:pPr>
+        <w:spacing w:after="120"/>
+      </w:pPr>
+      <w:r>
+        <w:rPr>
+          <w:rFonts w:ascii="Montserrat" w:cs="Montserrat" w:eastAsia="Montserrat" w:hAnsi="Montserrat"/>
+          <w:b w:val="false"/>
+          <w:bCs w:val="false"/>
+          <w:i w:val="false"/>
+          <w:iCs w:val="false"/>
+          <w:color w:val="111111"/>
+          <w:sz w:val="20"/>
+          <w:szCs w:val="20"/>
+        </w:rPr>
+        <w:t xml:space="preserve">The settings page lists the site JetEngine fields in dropdowns so the intro field, repeater and sub-fields are chosen rather than written into the code. This keeps the plugin portable to other client sites with differently named fields, and means a field rename does not require a developer.</w:t>
+      </w:r>
+    </w:p>
+    <w:p>
+      <w:pPr>
+        <w:pStyle w:val="Heading3"/>
+        <w:spacing w:after="100" w:before="200"/>
+      </w:pPr>
+      <w:r>
+        <w:rPr>
+          <w:rFonts w:ascii="Montserrat" w:cs="Montserrat" w:eastAsia="Montserrat" w:hAnsi="Montserrat"/>
+          <w:b/>
+          <w:bCs/>
+          <w:color w:val="2E5C4A"/>
+          <w:sz w:val="21"/>
+          <w:szCs w:val="21"/>
+        </w:rPr>
+        <w:t xml:space="preserve">Read time</w:t>
+      </w:r>
+    </w:p>
+    <w:p>
+      <w:pPr>
+        <w:spacing w:after="120"/>
+      </w:pPr>
+      <w:r>
+        <w:rPr>
+          <w:rFonts w:ascii="Montserrat" w:cs="Montserrat" w:eastAsia="Montserrat" w:hAnsi="Montserrat"/>
+          <w:b w:val="false"/>
+          <w:bCs w:val="false"/>
+          <w:i w:val="false"/>
+          <w:iCs w:val="false"/>
+          <w:color w:val="111111"/>
+          <w:sz w:val="20"/>
+          <w:szCs w:val="20"/>
+        </w:rPr>
+        <w:t xml:space="preserve">Read time is already calculated and displayed on posts by KDNA Reading Time, which handles JetEngine repeater decoding and dot notation sub-field targeting. This plugin calls that value rather than counting words again. Two plugins counting independently will eventually disagree, and an email claiming six minutes next to a page claiming seven looks careless. If KDNA Reading Time is inactive, the read time is omitted from the email entirely.</w:t>
       </w:r>
     </w:p>
     <w:p>
@@ -3114,408 +4067,221 @@
           <w:sz w:val="30"/>
           <w:szCs w:val="30"/>
         </w:rPr>
-        <w:t xml:space="preserve">6. File structure</w:t>
-      </w:r>
-    </w:p>
-    <w:p>
-      <w:pPr>
-        <w:shd w:fill="EDEFEE" w:color="auto" w:val="clear"/>
-        <w:spacing w:after="40"/>
-      </w:pPr>
-      <w:r>
-        <w:rPr>
-          <w:rFonts w:ascii="Consolas" w:cs="Consolas" w:eastAsia="Consolas" w:hAnsi="Consolas"/>
-          <w:color w:val="111111"/>
-          <w:sz w:val="18"/>
-          <w:szCs w:val="18"/>
-        </w:rPr>
-        <w:t xml:space="preserve">kdna-article-broadcast/</w:t>
-      </w:r>
-    </w:p>
-    <w:p>
-      <w:pPr>
-        <w:shd w:fill="EDEFEE" w:color="auto" w:val="clear"/>
-        <w:spacing w:after="40"/>
-      </w:pPr>
-      <w:r>
-        <w:rPr>
-          <w:rFonts w:ascii="Consolas" w:cs="Consolas" w:eastAsia="Consolas" w:hAnsi="Consolas"/>
-          <w:color w:val="111111"/>
-          <w:sz w:val="18"/>
-          <w:szCs w:val="18"/>
-        </w:rPr>
-        <w:t xml:space="preserve">  kdna-article-broadcast.php          main plugin file, hooks only</w:t>
-      </w:r>
-    </w:p>
-    <w:p>
-      <w:pPr>
-        <w:shd w:fill="EDEFEE" w:color="auto" w:val="clear"/>
-        <w:spacing w:after="40"/>
-      </w:pPr>
-      <w:r>
-        <w:rPr>
-          <w:rFonts w:ascii="Consolas" w:cs="Consolas" w:eastAsia="Consolas" w:hAnsi="Consolas"/>
-          <w:color w:val="111111"/>
-          <w:sz w:val="18"/>
-          <w:szCs w:val="18"/>
-        </w:rPr>
-        <w:t xml:space="preserve">  uninstall.php</w:t>
-      </w:r>
-    </w:p>
-    <w:p>
-      <w:pPr>
-        <w:shd w:fill="EDEFEE" w:color="auto" w:val="clear"/>
-        <w:spacing w:after="40"/>
-      </w:pPr>
-      <w:r>
-        <w:rPr>
-          <w:rFonts w:ascii="Consolas" w:cs="Consolas" w:eastAsia="Consolas" w:hAnsi="Consolas"/>
-          <w:color w:val="111111"/>
-          <w:sz w:val="18"/>
-          <w:szCs w:val="18"/>
-        </w:rPr>
-        <w:t xml:space="preserve">  includes/</w:t>
-      </w:r>
-    </w:p>
-    <w:p>
-      <w:pPr>
-        <w:shd w:fill="EDEFEE" w:color="auto" w:val="clear"/>
-        <w:spacing w:after="40"/>
-      </w:pPr>
-      <w:r>
-        <w:rPr>
-          <w:rFonts w:ascii="Consolas" w:cs="Consolas" w:eastAsia="Consolas" w:hAnsi="Consolas"/>
-          <w:color w:val="111111"/>
-          <w:sz w:val="18"/>
-          <w:szCs w:val="18"/>
-        </w:rPr>
-        <w:t xml:space="preserve">    class-kdna-ab-api.php             Campaign Monitor API wrapper</w:t>
-      </w:r>
-    </w:p>
-    <w:p>
-      <w:pPr>
-        <w:shd w:fill="EDEFEE" w:color="auto" w:val="clear"/>
-        <w:spacing w:after="40"/>
-      </w:pPr>
-      <w:r>
-        <w:rPr>
-          <w:rFonts w:ascii="Consolas" w:cs="Consolas" w:eastAsia="Consolas" w:hAnsi="Consolas"/>
-          <w:color w:val="111111"/>
-          <w:sz w:val="18"/>
-          <w:szCs w:val="18"/>
-        </w:rPr>
-        <w:t xml:space="preserve">    class-kdna-ab-settings.php        settings page and options</w:t>
-      </w:r>
-    </w:p>
-    <w:p>
-      <w:pPr>
-        <w:shd w:fill="EDEFEE" w:color="auto" w:val="clear"/>
-        <w:spacing w:after="40"/>
-      </w:pPr>
-      <w:r>
-        <w:rPr>
-          <w:rFonts w:ascii="Consolas" w:cs="Consolas" w:eastAsia="Consolas" w:hAnsi="Consolas"/>
-          <w:color w:val="111111"/>
-          <w:sz w:val="18"/>
-          <w:szCs w:val="18"/>
-        </w:rPr>
-        <w:t xml:space="preserve">    class-kdna-ab-meta-box.php        post editor panel</w:t>
-      </w:r>
-    </w:p>
-    <w:p>
-      <w:pPr>
-        <w:shd w:fill="EDEFEE" w:color="auto" w:val="clear"/>
-        <w:spacing w:after="40"/>
-      </w:pPr>
-      <w:r>
-        <w:rPr>
-          <w:rFonts w:ascii="Consolas" w:cs="Consolas" w:eastAsia="Consolas" w:hAnsi="Consolas"/>
-          <w:color w:val="111111"/>
-          <w:sz w:val="18"/>
-          <w:szCs w:val="18"/>
-        </w:rPr>
-        <w:t xml:space="preserve">    class-kdna-ab-content.php         content assembly and UTM builder</w:t>
-      </w:r>
-    </w:p>
-    <w:p>
-      <w:pPr>
-        <w:shd w:fill="EDEFEE" w:color="auto" w:val="clear"/>
-        <w:spacing w:after="40"/>
-      </w:pPr>
-      <w:r>
-        <w:rPr>
-          <w:rFonts w:ascii="Consolas" w:cs="Consolas" w:eastAsia="Consolas" w:hAnsi="Consolas"/>
-          <w:color w:val="111111"/>
-          <w:sz w:val="18"/>
-          <w:szCs w:val="18"/>
-        </w:rPr>
-        <w:t xml:space="preserve">    class-kdna-ab-sender.php          single article send logic</w:t>
-      </w:r>
-    </w:p>
-    <w:p>
-      <w:pPr>
-        <w:shd w:fill="EDEFEE" w:color="auto" w:val="clear"/>
-        <w:spacing w:after="40"/>
-      </w:pPr>
-      <w:r>
-        <w:rPr>
-          <w:rFonts w:ascii="Consolas" w:cs="Consolas" w:eastAsia="Consolas" w:hAnsi="Consolas"/>
-          <w:color w:val="111111"/>
-          <w:sz w:val="18"/>
-          <w:szCs w:val="18"/>
-        </w:rPr>
-        <w:t xml:space="preserve">    class-kdna-ab-digest.php          weekly digest logic</w:t>
-      </w:r>
-    </w:p>
-    <w:p>
-      <w:pPr>
-        <w:shd w:fill="EDEFEE" w:color="auto" w:val="clear"/>
-        <w:spacing w:after="40"/>
-      </w:pPr>
-      <w:r>
-        <w:rPr>
-          <w:rFonts w:ascii="Consolas" w:cs="Consolas" w:eastAsia="Consolas" w:hAnsi="Consolas"/>
-          <w:color w:val="111111"/>
-          <w:sz w:val="18"/>
-          <w:szCs w:val="18"/>
-        </w:rPr>
-        <w:t xml:space="preserve">    class-kdna-ab-log.php             send log table and list screen</w:t>
-      </w:r>
-    </w:p>
-    <w:p>
-      <w:pPr>
-        <w:shd w:fill="EDEFEE" w:color="auto" w:val="clear"/>
-        <w:spacing w:after="40"/>
-      </w:pPr>
-      <w:r>
-        <w:rPr>
-          <w:rFonts w:ascii="Consolas" w:cs="Consolas" w:eastAsia="Consolas" w:hAnsi="Consolas"/>
-          <w:color w:val="111111"/>
-          <w:sz w:val="18"/>
-          <w:szCs w:val="18"/>
-        </w:rPr>
-        <w:t xml:space="preserve">    class-kdna-ab-retry.php           cron retry handling</w:t>
-      </w:r>
-    </w:p>
-    <w:p>
-      <w:pPr>
-        <w:shd w:fill="EDEFEE" w:color="auto" w:val="clear"/>
-        <w:spacing w:after="40"/>
-      </w:pPr>
-      <w:r>
-        <w:rPr>
-          <w:rFonts w:ascii="Consolas" w:cs="Consolas" w:eastAsia="Consolas" w:hAnsi="Consolas"/>
-          <w:color w:val="111111"/>
-          <w:sz w:val="18"/>
-          <w:szCs w:val="18"/>
-        </w:rPr>
-        <w:t xml:space="preserve">    class-kdna-ab-subscribe.php       AJAX signup handler and reCAPTCHA</w:t>
-      </w:r>
-    </w:p>
-    <w:p>
-      <w:pPr>
-        <w:shd w:fill="EDEFEE" w:color="auto" w:val="clear"/>
-        <w:spacing w:after="40"/>
-      </w:pPr>
-      <w:r>
-        <w:rPr>
-          <w:rFonts w:ascii="Consolas" w:cs="Consolas" w:eastAsia="Consolas" w:hAnsi="Consolas"/>
-          <w:color w:val="111111"/>
-          <w:sz w:val="18"/>
-          <w:szCs w:val="18"/>
-        </w:rPr>
-        <w:t xml:space="preserve">    class-kdna-ab-elementor.php       widget registration and category</w:t>
-      </w:r>
-    </w:p>
-    <w:p>
-      <w:pPr>
-        <w:shd w:fill="EDEFEE" w:color="auto" w:val="clear"/>
-        <w:spacing w:after="40"/>
-      </w:pPr>
-      <w:r>
-        <w:rPr>
-          <w:rFonts w:ascii="Consolas" w:cs="Consolas" w:eastAsia="Consolas" w:hAnsi="Consolas"/>
-          <w:color w:val="111111"/>
-          <w:sz w:val="18"/>
-          <w:szCs w:val="18"/>
-        </w:rPr>
-        <w:t xml:space="preserve">  widgets/</w:t>
-      </w:r>
-    </w:p>
-    <w:p>
-      <w:pPr>
-        <w:shd w:fill="EDEFEE" w:color="auto" w:val="clear"/>
-        <w:spacing w:after="40"/>
-      </w:pPr>
-      <w:r>
-        <w:rPr>
-          <w:rFonts w:ascii="Consolas" w:cs="Consolas" w:eastAsia="Consolas" w:hAnsi="Consolas"/>
-          <w:color w:val="111111"/>
-          <w:sz w:val="18"/>
-          <w:szCs w:val="18"/>
-        </w:rPr>
-        <w:t xml:space="preserve">    class-kdna-ab-widget-subscribe.php</w:t>
-      </w:r>
-    </w:p>
-    <w:p>
-      <w:pPr>
-        <w:shd w:fill="EDEFEE" w:color="auto" w:val="clear"/>
-        <w:spacing w:after="40"/>
-      </w:pPr>
-      <w:r>
-        <w:rPr>
-          <w:rFonts w:ascii="Consolas" w:cs="Consolas" w:eastAsia="Consolas" w:hAnsi="Consolas"/>
-          <w:color w:val="111111"/>
-          <w:sz w:val="18"/>
-          <w:szCs w:val="18"/>
-        </w:rPr>
-        <w:t xml:space="preserve">    class-kdna-ab-widget-archive.php</w:t>
-      </w:r>
-    </w:p>
-    <w:p>
-      <w:pPr>
-        <w:shd w:fill="EDEFEE" w:color="auto" w:val="clear"/>
-        <w:spacing w:after="40"/>
-      </w:pPr>
-      <w:r>
-        <w:rPr>
-          <w:rFonts w:ascii="Consolas" w:cs="Consolas" w:eastAsia="Consolas" w:hAnsi="Consolas"/>
-          <w:color w:val="111111"/>
-          <w:sz w:val="18"/>
-          <w:szCs w:val="18"/>
-        </w:rPr>
-        <w:t xml:space="preserve">  admin/</w:t>
-      </w:r>
-    </w:p>
-    <w:p>
-      <w:pPr>
-        <w:shd w:fill="EDEFEE" w:color="auto" w:val="clear"/>
-        <w:spacing w:after="40"/>
-      </w:pPr>
-      <w:r>
-        <w:rPr>
-          <w:rFonts w:ascii="Consolas" w:cs="Consolas" w:eastAsia="Consolas" w:hAnsi="Consolas"/>
-          <w:color w:val="111111"/>
-          <w:sz w:val="18"/>
-          <w:szCs w:val="18"/>
-        </w:rPr>
-        <w:t xml:space="preserve">    admin-page.php</w:t>
-      </w:r>
-    </w:p>
-    <w:p>
-      <w:pPr>
-        <w:shd w:fill="EDEFEE" w:color="auto" w:val="clear"/>
-        <w:spacing w:after="40"/>
-      </w:pPr>
-      <w:r>
-        <w:rPr>
-          <w:rFonts w:ascii="Consolas" w:cs="Consolas" w:eastAsia="Consolas" w:hAnsi="Consolas"/>
-          <w:color w:val="111111"/>
-          <w:sz w:val="18"/>
-          <w:szCs w:val="18"/>
-        </w:rPr>
-        <w:t xml:space="preserve">    admin-style.css</w:t>
-      </w:r>
-    </w:p>
-    <w:p>
-      <w:pPr>
-        <w:shd w:fill="EDEFEE" w:color="auto" w:val="clear"/>
-        <w:spacing w:after="40"/>
-      </w:pPr>
-      <w:r>
-        <w:rPr>
-          <w:rFonts w:ascii="Consolas" w:cs="Consolas" w:eastAsia="Consolas" w:hAnsi="Consolas"/>
-          <w:color w:val="111111"/>
-          <w:sz w:val="18"/>
-          <w:szCs w:val="18"/>
-        </w:rPr>
-        <w:t xml:space="preserve">    admin-script.js</w:t>
-      </w:r>
-    </w:p>
-    <w:p>
-      <w:pPr>
-        <w:shd w:fill="EDEFEE" w:color="auto" w:val="clear"/>
-        <w:spacing w:after="40"/>
-      </w:pPr>
-      <w:r>
-        <w:rPr>
-          <w:rFonts w:ascii="Consolas" w:cs="Consolas" w:eastAsia="Consolas" w:hAnsi="Consolas"/>
-          <w:color w:val="111111"/>
-          <w:sz w:val="18"/>
-          <w:szCs w:val="18"/>
-        </w:rPr>
-        <w:t xml:space="preserve">  assets/</w:t>
-      </w:r>
-    </w:p>
-    <w:p>
-      <w:pPr>
-        <w:shd w:fill="EDEFEE" w:color="auto" w:val="clear"/>
-        <w:spacing w:after="40"/>
-      </w:pPr>
-      <w:r>
-        <w:rPr>
-          <w:rFonts w:ascii="Consolas" w:cs="Consolas" w:eastAsia="Consolas" w:hAnsi="Consolas"/>
-          <w:color w:val="111111"/>
-          <w:sz w:val="18"/>
-          <w:szCs w:val="18"/>
-        </w:rPr>
-        <w:t xml:space="preserve">    css/kdna-article-broadcast.css</w:t>
-      </w:r>
-    </w:p>
-    <w:p>
-      <w:pPr>
-        <w:shd w:fill="EDEFEE" w:color="auto" w:val="clear"/>
-        <w:spacing w:after="40"/>
-      </w:pPr>
-      <w:r>
-        <w:rPr>
-          <w:rFonts w:ascii="Consolas" w:cs="Consolas" w:eastAsia="Consolas" w:hAnsi="Consolas"/>
-          <w:color w:val="111111"/>
-          <w:sz w:val="18"/>
-          <w:szCs w:val="18"/>
-        </w:rPr>
-        <w:t xml:space="preserve">    js/kdna-article-broadcast.js</w:t>
-      </w:r>
-    </w:p>
-    <w:p>
-      <w:pPr>
-        <w:shd w:fill="EDEFEE" w:color="auto" w:val="clear"/>
-        <w:spacing w:after="40"/>
-      </w:pPr>
-      <w:r>
-        <w:rPr>
-          <w:rFonts w:ascii="Consolas" w:cs="Consolas" w:eastAsia="Consolas" w:hAnsi="Consolas"/>
-          <w:color w:val="111111"/>
-          <w:sz w:val="18"/>
-          <w:szCs w:val="18"/>
-        </w:rPr>
-        <w:t xml:space="preserve">  languages/</w:t>
-      </w:r>
-    </w:p>
-    <w:p>
-      <w:pPr>
-        <w:shd w:fill="EDEFEE" w:color="auto" w:val="clear"/>
-        <w:spacing w:after="40"/>
-      </w:pPr>
-      <w:r>
-        <w:rPr>
-          <w:rFonts w:ascii="Consolas" w:cs="Consolas" w:eastAsia="Consolas" w:hAnsi="Consolas"/>
-          <w:color w:val="111111"/>
-          <w:sz w:val="18"/>
-          <w:szCs w:val="18"/>
-        </w:rPr>
-        <w:t xml:space="preserve">  README.txt</w:t>
-      </w:r>
-    </w:p>
-    <w:p>
-      <w:pPr>
-        <w:spacing w:after="160"/>
+        <w:t xml:space="preserve">6. Campaign Monitor prerequisites</w:t>
+      </w:r>
+    </w:p>
+    <w:p>
+      <w:pPr>
+        <w:spacing w:after="120"/>
+      </w:pPr>
+      <w:r>
+        <w:rPr>
+          <w:rFonts w:ascii="Montserrat" w:cs="Montserrat" w:eastAsia="Montserrat" w:hAnsi="Montserrat"/>
+          <w:b w:val="false"/>
+          <w:bCs w:val="false"/>
+          <w:i w:val="false"/>
+          <w:iCs w:val="false"/>
+          <w:color w:val="111111"/>
+          <w:sz w:val="20"/>
+          <w:szCs w:val="20"/>
+        </w:rPr>
+        <w:t xml:space="preserve">These are things that must exist inside Campaign Monitor before the plugin can do anything. They are your job, not the plugin’s, but the build depends on them.</w:t>
+      </w:r>
+    </w:p>
+    <w:p>
+      <w:pPr>
+        <w:pStyle w:val="Heading3"/>
+        <w:spacing w:after="100" w:before="200"/>
+      </w:pPr>
+      <w:r>
+        <w:rPr>
+          <w:rFonts w:ascii="Montserrat" w:cs="Montserrat" w:eastAsia="Montserrat" w:hAnsi="Montserrat"/>
+          <w:b/>
+          <w:bCs/>
+          <w:color w:val="2E5C4A"/>
+          <w:sz w:val="21"/>
+          <w:szCs w:val="21"/>
+        </w:rPr>
+        <w:t xml:space="preserve">Two templates</w:t>
+      </w:r>
+    </w:p>
+    <w:p>
+      <w:pPr>
+        <w:pStyle w:val="ListParagraph"/>
+        <w:numPr>
+          <w:ilvl w:val="0"/>
+          <w:numId w:val="3"/>
+        </w:numPr>
+        <w:spacing w:after="60"/>
+      </w:pPr>
+      <w:r>
+        <w:rPr>
+          <w:rFonts w:ascii="Montserrat" w:cs="Montserrat" w:eastAsia="Montserrat" w:hAnsi="Montserrat"/>
+          <w:color w:val="111111"/>
+          <w:sz w:val="20"/>
+          <w:szCs w:val="20"/>
+        </w:rPr>
+        <w:t xml:space="preserve">Single article template, with editable regions for: subject heading, article title, teaser text, category, author, read time, article link, CTA label, and one image region for the featured image.</w:t>
+      </w:r>
+    </w:p>
+    <w:p>
+      <w:pPr>
+        <w:pStyle w:val="ListParagraph"/>
+        <w:numPr>
+          <w:ilvl w:val="0"/>
+          <w:numId w:val="3"/>
+        </w:numPr>
+        <w:spacing w:after="60"/>
+      </w:pPr>
+      <w:r>
+        <w:rPr>
+          <w:rFonts w:ascii="Montserrat" w:cs="Montserrat" w:eastAsia="Montserrat" w:hAnsi="Montserrat"/>
+          <w:color w:val="111111"/>
+          <w:sz w:val="20"/>
+          <w:szCs w:val="20"/>
+        </w:rPr>
+        <w:t xml:space="preserve">Weekly digest template, containing a repeater region so that one block repeats per article, with the same fields inside each repeated block, plus an intro region for a short editorial line at the top.</w:t>
+      </w:r>
+    </w:p>
+    <w:p>
+      <w:pPr>
+        <w:spacing w:after="80"/>
       </w:pPr>
       <w:r>
         <w:rPr>
           <w:rFonts w:ascii="Montserrat" w:cs="Montserrat" w:eastAsia="Montserrat" w:hAnsi="Montserrat"/>
         </w:rPr>
         <w:t xml:space="preserve"/>
+      </w:r>
+    </w:p>
+    <w:p>
+      <w:pPr>
+        <w:spacing w:after="120"/>
+      </w:pPr>
+      <w:r>
+        <w:rPr>
+          <w:rFonts w:ascii="Montserrat" w:cs="Montserrat" w:eastAsia="Montserrat" w:hAnsi="Montserrat"/>
+          <w:b w:val="false"/>
+          <w:bCs w:val="false"/>
+          <w:i/>
+          <w:iCs/>
+          <w:color w:val="111111"/>
+          <w:sz w:val="20"/>
+          <w:szCs w:val="20"/>
+        </w:rPr>
+        <w:t xml:space="preserve">Campaign Monitor requires a single-click unsubscribe link in every campaign, so both templates must contain an unsubscribe tag. A template without one will be rejected by the API.</w:t>
+      </w:r>
+    </w:p>
+    <w:p>
+      <w:pPr>
+        <w:pStyle w:val="Heading3"/>
+        <w:spacing w:after="100" w:before="200"/>
+      </w:pPr>
+      <w:r>
+        <w:rPr>
+          <w:rFonts w:ascii="Montserrat" w:cs="Montserrat" w:eastAsia="Montserrat" w:hAnsi="Montserrat"/>
+          <w:b/>
+          <w:bCs/>
+          <w:color w:val="2E5C4A"/>
+          <w:sz w:val="21"/>
+          <w:szCs w:val="21"/>
+        </w:rPr>
+        <w:t xml:space="preserve">Other prerequisites</w:t>
+      </w:r>
+    </w:p>
+    <w:p>
+      <w:pPr>
+        <w:pStyle w:val="ListParagraph"/>
+        <w:numPr>
+          <w:ilvl w:val="0"/>
+          <w:numId w:val="3"/>
+        </w:numPr>
+        <w:spacing w:after="60"/>
+      </w:pPr>
+      <w:r>
+        <w:rPr>
+          <w:rFonts w:ascii="Montserrat" w:cs="Montserrat" w:eastAsia="Montserrat" w:hAnsi="Montserrat"/>
+          <w:color w:val="111111"/>
+          <w:sz w:val="20"/>
+          <w:szCs w:val="20"/>
+        </w:rPr>
+        <w:t xml:space="preserve">API key for the account, with permission to create and send campaigns and to import subscribers.</w:t>
+      </w:r>
+    </w:p>
+    <w:p>
+      <w:pPr>
+        <w:pStyle w:val="ListParagraph"/>
+        <w:numPr>
+          <w:ilvl w:val="0"/>
+          <w:numId w:val="3"/>
+        </w:numPr>
+        <w:spacing w:after="60"/>
+      </w:pPr>
+      <w:r>
+        <w:rPr>
+          <w:rFonts w:ascii="Montserrat" w:cs="Montserrat" w:eastAsia="Montserrat" w:hAnsi="Montserrat"/>
+          <w:color w:val="111111"/>
+          <w:sz w:val="20"/>
+          <w:szCs w:val="20"/>
+        </w:rPr>
+        <w:t xml:space="preserve">A verified from address for the client this site belongs to.</w:t>
+      </w:r>
+    </w:p>
+    <w:p>
+      <w:pPr>
+        <w:pStyle w:val="ListParagraph"/>
+        <w:numPr>
+          <w:ilvl w:val="0"/>
+          <w:numId w:val="3"/>
+        </w:numPr>
+        <w:spacing w:after="60"/>
+      </w:pPr>
+      <w:r>
+        <w:rPr>
+          <w:rFonts w:ascii="Montserrat" w:cs="Montserrat" w:eastAsia="Montserrat" w:hAnsi="Montserrat"/>
+          <w:color w:val="111111"/>
+          <w:sz w:val="20"/>
+          <w:szCs w:val="20"/>
+        </w:rPr>
+        <w:t xml:space="preserve">The subscriber list this site sends to, with custom fields created for the consent metadata: signup date, signup IP and signup page.</w:t>
+      </w:r>
+    </w:p>
+    <w:p>
+      <w:pPr>
+        <w:pStyle w:val="ListParagraph"/>
+        <w:numPr>
+          <w:ilvl w:val="0"/>
+          <w:numId w:val="3"/>
+        </w:numPr>
+        <w:spacing w:after="60"/>
+      </w:pPr>
+      <w:r>
+        <w:rPr>
+          <w:rFonts w:ascii="Montserrat" w:cs="Montserrat" w:eastAsia="Montserrat" w:hAnsi="Montserrat"/>
+          <w:color w:val="111111"/>
+          <w:sz w:val="20"/>
+          <w:szCs w:val="20"/>
+        </w:rPr>
+        <w:t xml:space="preserve">A designed confirmation email for double opt-in, since new subscribers will receive it before they are added.</w:t>
+      </w:r>
+    </w:p>
+    <w:p>
+      <w:pPr>
+        <w:pStyle w:val="ListParagraph"/>
+        <w:numPr>
+          <w:ilvl w:val="0"/>
+          <w:numId w:val="3"/>
+        </w:numPr>
+        <w:spacing w:after="60"/>
+      </w:pPr>
+      <w:r>
+        <w:rPr>
+          <w:rFonts w:ascii="Montserrat" w:cs="Montserrat" w:eastAsia="Montserrat" w:hAnsi="Montserrat"/>
+          <w:color w:val="111111"/>
+          <w:sz w:val="20"/>
+          <w:szCs w:val="20"/>
+        </w:rPr>
+        <w:t xml:space="preserve">Google reCAPTCHA v3 site key and secret key for the domain.</w:t>
       </w:r>
     </w:p>
     <w:p>
@@ -3535,7 +4301,428 @@
           <w:sz w:val="30"/>
           <w:szCs w:val="30"/>
         </w:rPr>
-        <w:t xml:space="preserve">7. Data stored</w:t>
+        <w:t xml:space="preserve">7. File structure</w:t>
+      </w:r>
+    </w:p>
+    <w:p>
+      <w:pPr>
+        <w:shd w:fill="EDEFEE" w:color="auto" w:val="clear"/>
+        <w:spacing w:after="40"/>
+      </w:pPr>
+      <w:r>
+        <w:rPr>
+          <w:rFonts w:ascii="Consolas" w:cs="Consolas" w:eastAsia="Consolas" w:hAnsi="Consolas"/>
+          <w:color w:val="111111"/>
+          <w:sz w:val="18"/>
+          <w:szCs w:val="18"/>
+        </w:rPr>
+        <w:t xml:space="preserve">kdna-article-broadcast/</w:t>
+      </w:r>
+    </w:p>
+    <w:p>
+      <w:pPr>
+        <w:shd w:fill="EDEFEE" w:color="auto" w:val="clear"/>
+        <w:spacing w:after="40"/>
+      </w:pPr>
+      <w:r>
+        <w:rPr>
+          <w:rFonts w:ascii="Consolas" w:cs="Consolas" w:eastAsia="Consolas" w:hAnsi="Consolas"/>
+          <w:color w:val="111111"/>
+          <w:sz w:val="18"/>
+          <w:szCs w:val="18"/>
+        </w:rPr>
+        <w:t xml:space="preserve">  kdna-article-broadcast.php          main plugin file, hooks only</w:t>
+      </w:r>
+    </w:p>
+    <w:p>
+      <w:pPr>
+        <w:shd w:fill="EDEFEE" w:color="auto" w:val="clear"/>
+        <w:spacing w:after="40"/>
+      </w:pPr>
+      <w:r>
+        <w:rPr>
+          <w:rFonts w:ascii="Consolas" w:cs="Consolas" w:eastAsia="Consolas" w:hAnsi="Consolas"/>
+          <w:color w:val="111111"/>
+          <w:sz w:val="18"/>
+          <w:szCs w:val="18"/>
+        </w:rPr>
+        <w:t xml:space="preserve">  uninstall.php</w:t>
+      </w:r>
+    </w:p>
+    <w:p>
+      <w:pPr>
+        <w:shd w:fill="EDEFEE" w:color="auto" w:val="clear"/>
+        <w:spacing w:after="40"/>
+      </w:pPr>
+      <w:r>
+        <w:rPr>
+          <w:rFonts w:ascii="Consolas" w:cs="Consolas" w:eastAsia="Consolas" w:hAnsi="Consolas"/>
+          <w:color w:val="111111"/>
+          <w:sz w:val="18"/>
+          <w:szCs w:val="18"/>
+        </w:rPr>
+        <w:t xml:space="preserve">  includes/</w:t>
+      </w:r>
+    </w:p>
+    <w:p>
+      <w:pPr>
+        <w:shd w:fill="EDEFEE" w:color="auto" w:val="clear"/>
+        <w:spacing w:after="40"/>
+      </w:pPr>
+      <w:r>
+        <w:rPr>
+          <w:rFonts w:ascii="Consolas" w:cs="Consolas" w:eastAsia="Consolas" w:hAnsi="Consolas"/>
+          <w:color w:val="111111"/>
+          <w:sz w:val="18"/>
+          <w:szCs w:val="18"/>
+        </w:rPr>
+        <w:t xml:space="preserve">    class-kdna-ab-api.php             Campaign Monitor API wrapper</w:t>
+      </w:r>
+    </w:p>
+    <w:p>
+      <w:pPr>
+        <w:shd w:fill="EDEFEE" w:color="auto" w:val="clear"/>
+        <w:spacing w:after="40"/>
+      </w:pPr>
+      <w:r>
+        <w:rPr>
+          <w:rFonts w:ascii="Consolas" w:cs="Consolas" w:eastAsia="Consolas" w:hAnsi="Consolas"/>
+          <w:color w:val="111111"/>
+          <w:sz w:val="18"/>
+          <w:szCs w:val="18"/>
+        </w:rPr>
+        <w:t xml:space="preserve">    class-kdna-ab-settings.php        settings page and options</w:t>
+      </w:r>
+    </w:p>
+    <w:p>
+      <w:pPr>
+        <w:shd w:fill="EDEFEE" w:color="auto" w:val="clear"/>
+        <w:spacing w:after="40"/>
+      </w:pPr>
+      <w:r>
+        <w:rPr>
+          <w:rFonts w:ascii="Consolas" w:cs="Consolas" w:eastAsia="Consolas" w:hAnsi="Consolas"/>
+          <w:color w:val="111111"/>
+          <w:sz w:val="18"/>
+          <w:szCs w:val="18"/>
+        </w:rPr>
+        <w:t xml:space="preserve">    class-kdna-ab-meta-box.php        post editor panel</w:t>
+      </w:r>
+    </w:p>
+    <w:p>
+      <w:pPr>
+        <w:shd w:fill="EDEFEE" w:color="auto" w:val="clear"/>
+        <w:spacing w:after="40"/>
+      </w:pPr>
+      <w:r>
+        <w:rPr>
+          <w:rFonts w:ascii="Consolas" w:cs="Consolas" w:eastAsia="Consolas" w:hAnsi="Consolas"/>
+          <w:color w:val="111111"/>
+          <w:sz w:val="18"/>
+          <w:szCs w:val="18"/>
+        </w:rPr>
+        <w:t xml:space="preserve">    class-kdna-ab-content.php         content assembly and UTM builder</w:t>
+      </w:r>
+    </w:p>
+    <w:p>
+      <w:pPr>
+        <w:shd w:fill="EDEFEE" w:color="auto" w:val="clear"/>
+        <w:spacing w:after="40"/>
+      </w:pPr>
+      <w:r>
+        <w:rPr>
+          <w:rFonts w:ascii="Consolas" w:cs="Consolas" w:eastAsia="Consolas" w:hAnsi="Consolas"/>
+          <w:color w:val="111111"/>
+          <w:sz w:val="18"/>
+          <w:szCs w:val="18"/>
+        </w:rPr>
+        <w:t xml:space="preserve">    class-kdna-ab-sender.php          single article send logic</w:t>
+      </w:r>
+    </w:p>
+    <w:p>
+      <w:pPr>
+        <w:shd w:fill="EDEFEE" w:color="auto" w:val="clear"/>
+        <w:spacing w:after="40"/>
+      </w:pPr>
+      <w:r>
+        <w:rPr>
+          <w:rFonts w:ascii="Consolas" w:cs="Consolas" w:eastAsia="Consolas" w:hAnsi="Consolas"/>
+          <w:color w:val="111111"/>
+          <w:sz w:val="18"/>
+          <w:szCs w:val="18"/>
+        </w:rPr>
+        <w:t xml:space="preserve">    class-kdna-ab-digest.php          weekly digest logic</w:t>
+      </w:r>
+    </w:p>
+    <w:p>
+      <w:pPr>
+        <w:shd w:fill="EDEFEE" w:color="auto" w:val="clear"/>
+        <w:spacing w:after="40"/>
+      </w:pPr>
+      <w:r>
+        <w:rPr>
+          <w:rFonts w:ascii="Consolas" w:cs="Consolas" w:eastAsia="Consolas" w:hAnsi="Consolas"/>
+          <w:color w:val="111111"/>
+          <w:sz w:val="18"/>
+          <w:szCs w:val="18"/>
+        </w:rPr>
+        <w:t xml:space="preserve">    class-kdna-ab-log.php             send log table and list screen</w:t>
+      </w:r>
+    </w:p>
+    <w:p>
+      <w:pPr>
+        <w:shd w:fill="EDEFEE" w:color="auto" w:val="clear"/>
+        <w:spacing w:after="40"/>
+      </w:pPr>
+      <w:r>
+        <w:rPr>
+          <w:rFonts w:ascii="Consolas" w:cs="Consolas" w:eastAsia="Consolas" w:hAnsi="Consolas"/>
+          <w:color w:val="111111"/>
+          <w:sz w:val="18"/>
+          <w:szCs w:val="18"/>
+        </w:rPr>
+        <w:t xml:space="preserve">    class-kdna-ab-retry.php           cron retry handling</w:t>
+      </w:r>
+    </w:p>
+    <w:p>
+      <w:pPr>
+        <w:shd w:fill="EDEFEE" w:color="auto" w:val="clear"/>
+        <w:spacing w:after="40"/>
+      </w:pPr>
+      <w:r>
+        <w:rPr>
+          <w:rFonts w:ascii="Consolas" w:cs="Consolas" w:eastAsia="Consolas" w:hAnsi="Consolas"/>
+          <w:color w:val="111111"/>
+          <w:sz w:val="18"/>
+          <w:szCs w:val="18"/>
+        </w:rPr>
+        <w:t xml:space="preserve">    class-kdna-ab-subscribe.php       AJAX signup handler and reCAPTCHA</w:t>
+      </w:r>
+    </w:p>
+    <w:p>
+      <w:pPr>
+        <w:shd w:fill="EDEFEE" w:color="auto" w:val="clear"/>
+        <w:spacing w:after="40"/>
+      </w:pPr>
+      <w:r>
+        <w:rPr>
+          <w:rFonts w:ascii="Consolas" w:cs="Consolas" w:eastAsia="Consolas" w:hAnsi="Consolas"/>
+          <w:color w:val="111111"/>
+          <w:sz w:val="18"/>
+          <w:szCs w:val="18"/>
+        </w:rPr>
+        <w:t xml:space="preserve">    class-kdna-ab-elementor.php       widget registration and category</w:t>
+      </w:r>
+    </w:p>
+    <w:p>
+      <w:pPr>
+        <w:shd w:fill="EDEFEE" w:color="auto" w:val="clear"/>
+        <w:spacing w:after="40"/>
+      </w:pPr>
+      <w:r>
+        <w:rPr>
+          <w:rFonts w:ascii="Consolas" w:cs="Consolas" w:eastAsia="Consolas" w:hAnsi="Consolas"/>
+          <w:color w:val="111111"/>
+          <w:sz w:val="18"/>
+          <w:szCs w:val="18"/>
+        </w:rPr>
+        <w:t xml:space="preserve">  widgets/</w:t>
+      </w:r>
+    </w:p>
+    <w:p>
+      <w:pPr>
+        <w:shd w:fill="EDEFEE" w:color="auto" w:val="clear"/>
+        <w:spacing w:after="40"/>
+      </w:pPr>
+      <w:r>
+        <w:rPr>
+          <w:rFonts w:ascii="Consolas" w:cs="Consolas" w:eastAsia="Consolas" w:hAnsi="Consolas"/>
+          <w:color w:val="111111"/>
+          <w:sz w:val="18"/>
+          <w:szCs w:val="18"/>
+        </w:rPr>
+        <w:t xml:space="preserve">    class-kdna-ab-widget-subscribe.php</w:t>
+      </w:r>
+    </w:p>
+    <w:p>
+      <w:pPr>
+        <w:shd w:fill="EDEFEE" w:color="auto" w:val="clear"/>
+        <w:spacing w:after="40"/>
+      </w:pPr>
+      <w:r>
+        <w:rPr>
+          <w:rFonts w:ascii="Consolas" w:cs="Consolas" w:eastAsia="Consolas" w:hAnsi="Consolas"/>
+          <w:color w:val="111111"/>
+          <w:sz w:val="18"/>
+          <w:szCs w:val="18"/>
+        </w:rPr>
+        <w:t xml:space="preserve">    class-kdna-ab-widget-archive.php</w:t>
+      </w:r>
+    </w:p>
+    <w:p>
+      <w:pPr>
+        <w:shd w:fill="EDEFEE" w:color="auto" w:val="clear"/>
+        <w:spacing w:after="40"/>
+      </w:pPr>
+      <w:r>
+        <w:rPr>
+          <w:rFonts w:ascii="Consolas" w:cs="Consolas" w:eastAsia="Consolas" w:hAnsi="Consolas"/>
+          <w:color w:val="111111"/>
+          <w:sz w:val="18"/>
+          <w:szCs w:val="18"/>
+        </w:rPr>
+        <w:t xml:space="preserve">  admin/</w:t>
+      </w:r>
+    </w:p>
+    <w:p>
+      <w:pPr>
+        <w:shd w:fill="EDEFEE" w:color="auto" w:val="clear"/>
+        <w:spacing w:after="40"/>
+      </w:pPr>
+      <w:r>
+        <w:rPr>
+          <w:rFonts w:ascii="Consolas" w:cs="Consolas" w:eastAsia="Consolas" w:hAnsi="Consolas"/>
+          <w:color w:val="111111"/>
+          <w:sz w:val="18"/>
+          <w:szCs w:val="18"/>
+        </w:rPr>
+        <w:t xml:space="preserve">    admin-page.php</w:t>
+      </w:r>
+    </w:p>
+    <w:p>
+      <w:pPr>
+        <w:shd w:fill="EDEFEE" w:color="auto" w:val="clear"/>
+        <w:spacing w:after="40"/>
+      </w:pPr>
+      <w:r>
+        <w:rPr>
+          <w:rFonts w:ascii="Consolas" w:cs="Consolas" w:eastAsia="Consolas" w:hAnsi="Consolas"/>
+          <w:color w:val="111111"/>
+          <w:sz w:val="18"/>
+          <w:szCs w:val="18"/>
+        </w:rPr>
+        <w:t xml:space="preserve">    admin-style.css</w:t>
+      </w:r>
+    </w:p>
+    <w:p>
+      <w:pPr>
+        <w:shd w:fill="EDEFEE" w:color="auto" w:val="clear"/>
+        <w:spacing w:after="40"/>
+      </w:pPr>
+      <w:r>
+        <w:rPr>
+          <w:rFonts w:ascii="Consolas" w:cs="Consolas" w:eastAsia="Consolas" w:hAnsi="Consolas"/>
+          <w:color w:val="111111"/>
+          <w:sz w:val="18"/>
+          <w:szCs w:val="18"/>
+        </w:rPr>
+        <w:t xml:space="preserve">    admin-script.js</w:t>
+      </w:r>
+    </w:p>
+    <w:p>
+      <w:pPr>
+        <w:shd w:fill="EDEFEE" w:color="auto" w:val="clear"/>
+        <w:spacing w:after="40"/>
+      </w:pPr>
+      <w:r>
+        <w:rPr>
+          <w:rFonts w:ascii="Consolas" w:cs="Consolas" w:eastAsia="Consolas" w:hAnsi="Consolas"/>
+          <w:color w:val="111111"/>
+          <w:sz w:val="18"/>
+          <w:szCs w:val="18"/>
+        </w:rPr>
+        <w:t xml:space="preserve">  assets/</w:t>
+      </w:r>
+    </w:p>
+    <w:p>
+      <w:pPr>
+        <w:shd w:fill="EDEFEE" w:color="auto" w:val="clear"/>
+        <w:spacing w:after="40"/>
+      </w:pPr>
+      <w:r>
+        <w:rPr>
+          <w:rFonts w:ascii="Consolas" w:cs="Consolas" w:eastAsia="Consolas" w:hAnsi="Consolas"/>
+          <w:color w:val="111111"/>
+          <w:sz w:val="18"/>
+          <w:szCs w:val="18"/>
+        </w:rPr>
+        <w:t xml:space="preserve">    css/kdna-article-broadcast.css</w:t>
+      </w:r>
+    </w:p>
+    <w:p>
+      <w:pPr>
+        <w:shd w:fill="EDEFEE" w:color="auto" w:val="clear"/>
+        <w:spacing w:after="40"/>
+      </w:pPr>
+      <w:r>
+        <w:rPr>
+          <w:rFonts w:ascii="Consolas" w:cs="Consolas" w:eastAsia="Consolas" w:hAnsi="Consolas"/>
+          <w:color w:val="111111"/>
+          <w:sz w:val="18"/>
+          <w:szCs w:val="18"/>
+        </w:rPr>
+        <w:t xml:space="preserve">    js/kdna-article-broadcast.js</w:t>
+      </w:r>
+    </w:p>
+    <w:p>
+      <w:pPr>
+        <w:shd w:fill="EDEFEE" w:color="auto" w:val="clear"/>
+        <w:spacing w:after="40"/>
+      </w:pPr>
+      <w:r>
+        <w:rPr>
+          <w:rFonts w:ascii="Consolas" w:cs="Consolas" w:eastAsia="Consolas" w:hAnsi="Consolas"/>
+          <w:color w:val="111111"/>
+          <w:sz w:val="18"/>
+          <w:szCs w:val="18"/>
+        </w:rPr>
+        <w:t xml:space="preserve">  languages/</w:t>
+      </w:r>
+    </w:p>
+    <w:p>
+      <w:pPr>
+        <w:shd w:fill="EDEFEE" w:color="auto" w:val="clear"/>
+        <w:spacing w:after="40"/>
+      </w:pPr>
+      <w:r>
+        <w:rPr>
+          <w:rFonts w:ascii="Consolas" w:cs="Consolas" w:eastAsia="Consolas" w:hAnsi="Consolas"/>
+          <w:color w:val="111111"/>
+          <w:sz w:val="18"/>
+          <w:szCs w:val="18"/>
+        </w:rPr>
+        <w:t xml:space="preserve">  README.txt</w:t>
+      </w:r>
+    </w:p>
+    <w:p>
+      <w:pPr>
+        <w:spacing w:after="160"/>
+      </w:pPr>
+      <w:r>
+        <w:rPr>
+          <w:rFonts w:ascii="Montserrat" w:cs="Montserrat" w:eastAsia="Montserrat" w:hAnsi="Montserrat"/>
+        </w:rPr>
+        <w:t xml:space="preserve"/>
+      </w:r>
+    </w:p>
+    <w:p>
+      <w:pPr>
+        <w:pStyle w:val="Heading1"/>
+        <w:pBdr>
+          <w:bottom w:val="single" w:color="1B3A2F" w:sz="8" w:space="6"/>
+        </w:pBdr>
+        <w:spacing w:after="200" w:before="400"/>
+      </w:pPr>
+      <w:r>
+        <w:rPr>
+          <w:rFonts w:ascii="Montserrat" w:cs="Montserrat" w:eastAsia="Montserrat" w:hAnsi="Montserrat"/>
+          <w:b/>
+          <w:bCs/>
+          <w:color w:val="1B3A2F"/>
+          <w:sz w:val="30"/>
+          <w:szCs w:val="30"/>
+        </w:rPr>
+        <w:t xml:space="preserve">8. Data stored</w:t>
       </w:r>
     </w:p>
     <w:tbl>
@@ -3928,7 +5115,7 @@
           <w:sz w:val="30"/>
           <w:szCs w:val="30"/>
         </w:rPr>
-        <w:t xml:space="preserve">8. Build stages</w:t>
+        <w:t xml:space="preserve">9. Build stages</w:t>
       </w:r>
     </w:p>
     <w:p>
@@ -4969,7 +6156,7 @@
           <w:sz w:val="20"/>
           <w:szCs w:val="20"/>
         </w:rPr>
-        <w:t xml:space="preserve">The layer that turns a WordPress post into the values Campaign Monitor needs, with no sending logic yet.</w:t>
+        <w:t xml:space="preserve">The layer that turns a WordPress post into the values Campaign Monitor needs, reading content from JetEngine fields rather than post_content. No sending logic yet.</w:t>
       </w:r>
     </w:p>
     <w:p>
@@ -5005,45 +6192,140 @@
           <w:sz w:val="20"/>
           <w:szCs w:val="20"/>
         </w:rPr>
-        <w:t xml:space="preserve">Teaser generation: strip shortcodes, Elementor markup, headings, captions and scripts, then trim to a configurable word count, with a trim to nearest full sentence toggle.</w:t>
-      </w:r>
-    </w:p>
-    <w:p>
-      <w:pPr>
-        <w:pStyle w:val="ListParagraph"/>
-        <w:numPr>
-          <w:ilvl w:val="0"/>
-          <w:numId w:val="3"/>
-        </w:numPr>
-        <w:spacing w:after="60"/>
-      </w:pPr>
-      <w:r>
-        <w:rPr>
-          <w:rFonts w:ascii="Montserrat" w:cs="Montserrat" w:eastAsia="Montserrat" w:hAnsi="Montserrat"/>
-          <w:color w:val="111111"/>
-          <w:sz w:val="20"/>
-          <w:szCs w:val="20"/>
-        </w:rPr>
-        <w:t xml:space="preserve">Featured image handling: register a dedicated email image size, default 1200 by 630, fall back to a configurable placeholder image when a post has no featured image.</w:t>
-      </w:r>
-    </w:p>
-    <w:p>
-      <w:pPr>
-        <w:pStyle w:val="ListParagraph"/>
-        <w:numPr>
-          <w:ilvl w:val="0"/>
-          <w:numId w:val="3"/>
-        </w:numPr>
-        <w:spacing w:after="60"/>
-      </w:pPr>
-      <w:r>
-        <w:rPr>
-          <w:rFonts w:ascii="Montserrat" w:cs="Montserrat" w:eastAsia="Montserrat" w:hAnsi="Montserrat"/>
-          <w:color w:val="111111"/>
-          <w:sz w:val="20"/>
-          <w:szCs w:val="20"/>
-        </w:rPr>
-        <w:t xml:space="preserve">Read time calculation at a configurable words per minute, default 200.</w:t>
+        <w:t xml:space="preserve">Content source mapping in settings, with dropdowns listing the available JetEngine meta fields so nothing is hard-coded: intro field, repeater field, and the repeater sub-field holding the body copy.</w:t>
+      </w:r>
+    </w:p>
+    <w:p>
+      <w:pPr>
+        <w:pStyle w:val="ListParagraph"/>
+        <w:numPr>
+          <w:ilvl w:val="0"/>
+          <w:numId w:val="3"/>
+        </w:numPr>
+        <w:spacing w:after="60"/>
+      </w:pPr>
+      <w:r>
+        <w:rPr>
+          <w:rFonts w:ascii="Montserrat" w:cs="Montserrat" w:eastAsia="Montserrat" w:hAnsi="Montserrat"/>
+          <w:color w:val="111111"/>
+          <w:sz w:val="20"/>
+          <w:szCs w:val="20"/>
+        </w:rPr>
+        <w:t xml:space="preserve">Defaults for this site: intro field selected by Nick, repeater article_sections, body sub-field article_sections.section_bodycopy, heading sub-field article_sections.section_heading, image sub-field article_sections.section_image.</w:t>
+      </w:r>
+    </w:p>
+    <w:p>
+      <w:pPr>
+        <w:pStyle w:val="ListParagraph"/>
+        <w:numPr>
+          <w:ilvl w:val="0"/>
+          <w:numId w:val="3"/>
+        </w:numPr>
+        <w:spacing w:after="60"/>
+      </w:pPr>
+      <w:r>
+        <w:rPr>
+          <w:rFonts w:ascii="Montserrat" w:cs="Montserrat" w:eastAsia="Montserrat" w:hAnsi="Montserrat"/>
+          <w:color w:val="111111"/>
+          <w:sz w:val="20"/>
+          <w:szCs w:val="20"/>
+        </w:rPr>
+        <w:t xml:space="preserve">JetEngine repeater decoding: the repeater is stored as a JSON string in a single meta key, so it must be decoded and walked in stored row order, which matches the order set in the editor. Never treat the raw meta value as text.</w:t>
+      </w:r>
+    </w:p>
+    <w:p>
+      <w:pPr>
+        <w:pStyle w:val="ListParagraph"/>
+        <w:numPr>
+          <w:ilvl w:val="0"/>
+          <w:numId w:val="3"/>
+        </w:numPr>
+        <w:spacing w:after="60"/>
+      </w:pPr>
+      <w:r>
+        <w:rPr>
+          <w:rFonts w:ascii="Montserrat" w:cs="Montserrat" w:eastAsia="Montserrat" w:hAnsi="Montserrat"/>
+          <w:color w:val="111111"/>
+          <w:sz w:val="20"/>
+          <w:szCs w:val="20"/>
+        </w:rPr>
+        <w:t xml:space="preserve">Teaser generation: start with the intro field, and only continue into the first repeater row body copy if the configured word count has not been reached. Strip HTML added by the WYSIWYG, strip shortcodes, embeds and captions, collapse whitespace, then trim with a trim to nearest full sentence toggle.</w:t>
+      </w:r>
+    </w:p>
+    <w:p>
+      <w:pPr>
+        <w:pStyle w:val="ListParagraph"/>
+        <w:numPr>
+          <w:ilvl w:val="0"/>
+          <w:numId w:val="3"/>
+        </w:numPr>
+        <w:spacing w:after="60"/>
+      </w:pPr>
+      <w:r>
+        <w:rPr>
+          <w:rFonts w:ascii="Montserrat" w:cs="Montserrat" w:eastAsia="Montserrat" w:hAnsi="Montserrat"/>
+          <w:color w:val="111111"/>
+          <w:sz w:val="20"/>
+          <w:szCs w:val="20"/>
+        </w:rPr>
+        <w:t xml:space="preserve">Character encoding: convert registered trademark symbols, curly quotes, apostrophes, ellipses and non-breaking spaces to HTML entities before sending, so they render correctly in Outlook rather than appearing as garbled characters.</w:t>
+      </w:r>
+    </w:p>
+    <w:p>
+      <w:pPr>
+        <w:pStyle w:val="ListParagraph"/>
+        <w:numPr>
+          <w:ilvl w:val="0"/>
+          <w:numId w:val="3"/>
+        </w:numPr>
+        <w:spacing w:after="60"/>
+      </w:pPr>
+      <w:r>
+        <w:rPr>
+          <w:rFonts w:ascii="Montserrat" w:cs="Montserrat" w:eastAsia="Montserrat" w:hAnsi="Montserrat"/>
+          <w:color w:val="111111"/>
+          <w:sz w:val="20"/>
+          <w:szCs w:val="20"/>
+        </w:rPr>
+        <w:t xml:space="preserve">Optional setting to use the first row section_heading as the email preview text instead of the teaser opening.</w:t>
+      </w:r>
+    </w:p>
+    <w:p>
+      <w:pPr>
+        <w:pStyle w:val="ListParagraph"/>
+        <w:numPr>
+          <w:ilvl w:val="0"/>
+          <w:numId w:val="3"/>
+        </w:numPr>
+        <w:spacing w:after="60"/>
+      </w:pPr>
+      <w:r>
+        <w:rPr>
+          <w:rFonts w:ascii="Montserrat" w:cs="Montserrat" w:eastAsia="Montserrat" w:hAnsi="Montserrat"/>
+          <w:color w:val="111111"/>
+          <w:sz w:val="20"/>
+          <w:szCs w:val="20"/>
+        </w:rPr>
+        <w:t xml:space="preserve">Featured image handling: register a dedicated email image size, default 1200 by 630. Use the WordPress featured image first, fall back to the first repeater row section_image, then fall back to a configurable placeholder.</w:t>
+      </w:r>
+    </w:p>
+    <w:p>
+      <w:pPr>
+        <w:pStyle w:val="ListParagraph"/>
+        <w:numPr>
+          <w:ilvl w:val="0"/>
+          <w:numId w:val="3"/>
+        </w:numPr>
+        <w:spacing w:after="60"/>
+      </w:pPr>
+      <w:r>
+        <w:rPr>
+          <w:rFonts w:ascii="Montserrat" w:cs="Montserrat" w:eastAsia="Montserrat" w:hAnsi="Montserrat"/>
+          <w:color w:val="111111"/>
+          <w:sz w:val="20"/>
+          <w:szCs w:val="20"/>
+        </w:rPr>
+        <w:t xml:space="preserve">Read time is not calculated here. Call KDNA Reading Time for the value so the email always matches the figure shown on the post. If that plugin is inactive or returns nothing, omit the read time from the email rather than showing a wrong or empty value.</w:t>
       </w:r>
     </w:p>
     <w:p>
@@ -5101,6 +6383,25 @@
           <w:szCs w:val="20"/>
         </w:rPr>
         <w:t xml:space="preserve">UTM builder appending configurable utm_source, utm_medium and utm_campaign values to every post link, with a token for the send date and post slug.</w:t>
+      </w:r>
+    </w:p>
+    <w:p>
+      <w:pPr>
+        <w:pStyle w:val="ListParagraph"/>
+        <w:numPr>
+          <w:ilvl w:val="0"/>
+          <w:numId w:val="3"/>
+        </w:numPr>
+        <w:spacing w:after="60"/>
+      </w:pPr>
+      <w:r>
+        <w:rPr>
+          <w:rFonts w:ascii="Montserrat" w:cs="Montserrat" w:eastAsia="Montserrat" w:hAnsi="Montserrat"/>
+          <w:color w:val="111111"/>
+          <w:sz w:val="20"/>
+          <w:szCs w:val="20"/>
+        </w:rPr>
+        <w:t xml:space="preserve">Graceful degradation: if a post has an empty intro and an empty repeater, log a clear warning and block the send rather than producing an empty email.</w:t>
       </w:r>
     </w:p>
     <w:p>
@@ -5155,45 +6456,140 @@
           <w:sz w:val="20"/>
           <w:szCs w:val="20"/>
         </w:rPr>
-        <w:t xml:space="preserve">Teaser output contains no shortcodes, HTML tags or Elementor artefacts.</w:t>
-      </w:r>
-    </w:p>
-    <w:p>
-      <w:pPr>
-        <w:pStyle w:val="ListParagraph"/>
-        <w:numPr>
-          <w:ilvl w:val="0"/>
-          <w:numId w:val="3"/>
-        </w:numPr>
-        <w:spacing w:after="60"/>
-      </w:pPr>
-      <w:r>
-        <w:rPr>
-          <w:rFonts w:ascii="Montserrat" w:cs="Montserrat" w:eastAsia="Montserrat" w:hAnsi="Montserrat"/>
-          <w:color w:val="111111"/>
-          <w:sz w:val="20"/>
-          <w:szCs w:val="20"/>
-        </w:rPr>
-        <w:t xml:space="preserve">Word count setting is respected and sentence trimming works.</w:t>
-      </w:r>
-    </w:p>
-    <w:p>
-      <w:pPr>
-        <w:pStyle w:val="ListParagraph"/>
-        <w:numPr>
-          <w:ilvl w:val="0"/>
-          <w:numId w:val="3"/>
-        </w:numPr>
-        <w:spacing w:after="60"/>
-      </w:pPr>
-      <w:r>
-        <w:rPr>
-          <w:rFonts w:ascii="Montserrat" w:cs="Montserrat" w:eastAsia="Montserrat" w:hAnsi="Montserrat"/>
-          <w:color w:val="111111"/>
-          <w:sz w:val="20"/>
-          <w:szCs w:val="20"/>
-        </w:rPr>
-        <w:t xml:space="preserve">A post with no featured image falls back to the placeholder.</w:t>
+        <w:t xml:space="preserve">The field mapping dropdowns list real JetEngine fields from the site, not a hard-coded list.</w:t>
+      </w:r>
+    </w:p>
+    <w:p>
+      <w:pPr>
+        <w:pStyle w:val="ListParagraph"/>
+        <w:numPr>
+          <w:ilvl w:val="0"/>
+          <w:numId w:val="3"/>
+        </w:numPr>
+        <w:spacing w:after="60"/>
+      </w:pPr>
+      <w:r>
+        <w:rPr>
+          <w:rFonts w:ascii="Montserrat" w:cs="Montserrat" w:eastAsia="Montserrat" w:hAnsi="Montserrat"/>
+          <w:color w:val="111111"/>
+          <w:sz w:val="20"/>
+          <w:szCs w:val="20"/>
+        </w:rPr>
+        <w:t xml:space="preserve">Teaser output contains no HTML tags, shortcodes or WYSIWYG artefacts.</w:t>
+      </w:r>
+    </w:p>
+    <w:p>
+      <w:pPr>
+        <w:pStyle w:val="ListParagraph"/>
+        <w:numPr>
+          <w:ilvl w:val="0"/>
+          <w:numId w:val="3"/>
+        </w:numPr>
+        <w:spacing w:after="60"/>
+      </w:pPr>
+      <w:r>
+        <w:rPr>
+          <w:rFonts w:ascii="Montserrat" w:cs="Montserrat" w:eastAsia="Montserrat" w:hAnsi="Montserrat"/>
+          <w:color w:val="111111"/>
+          <w:sz w:val="20"/>
+          <w:szCs w:val="20"/>
+        </w:rPr>
+        <w:t xml:space="preserve">The teaser uses the intro alone when the intro is long enough, and only pulls from the first repeater row when it is not.</w:t>
+      </w:r>
+    </w:p>
+    <w:p>
+      <w:pPr>
+        <w:pStyle w:val="ListParagraph"/>
+        <w:numPr>
+          <w:ilvl w:val="0"/>
+          <w:numId w:val="3"/>
+        </w:numPr>
+        <w:spacing w:after="60"/>
+      </w:pPr>
+      <w:r>
+        <w:rPr>
+          <w:rFonts w:ascii="Montserrat" w:cs="Montserrat" w:eastAsia="Montserrat" w:hAnsi="Montserrat"/>
+          <w:color w:val="111111"/>
+          <w:sz w:val="20"/>
+          <w:szCs w:val="20"/>
+        </w:rPr>
+        <w:t xml:space="preserve">Apotheca with a registered trademark symbol, curly apostrophes and ellipses all render correctly in a test email in Outlook and Gmail.</w:t>
+      </w:r>
+    </w:p>
+    <w:p>
+      <w:pPr>
+        <w:pStyle w:val="ListParagraph"/>
+        <w:numPr>
+          <w:ilvl w:val="0"/>
+          <w:numId w:val="3"/>
+        </w:numPr>
+        <w:spacing w:after="60"/>
+      </w:pPr>
+      <w:r>
+        <w:rPr>
+          <w:rFonts w:ascii="Montserrat" w:cs="Montserrat" w:eastAsia="Montserrat" w:hAnsi="Montserrat"/>
+          <w:color w:val="111111"/>
+          <w:sz w:val="20"/>
+          <w:szCs w:val="20"/>
+        </w:rPr>
+        <w:t xml:space="preserve">A post with no WordPress featured image uses the first section image, and a post with neither uses the placeholder.</w:t>
+      </w:r>
+    </w:p>
+    <w:p>
+      <w:pPr>
+        <w:pStyle w:val="ListParagraph"/>
+        <w:numPr>
+          <w:ilvl w:val="0"/>
+          <w:numId w:val="3"/>
+        </w:numPr>
+        <w:spacing w:after="60"/>
+      </w:pPr>
+      <w:r>
+        <w:rPr>
+          <w:rFonts w:ascii="Montserrat" w:cs="Montserrat" w:eastAsia="Montserrat" w:hAnsi="Montserrat"/>
+          <w:color w:val="111111"/>
+          <w:sz w:val="20"/>
+          <w:szCs w:val="20"/>
+        </w:rPr>
+        <w:t xml:space="preserve">Read time in the preview matches the figure displayed on the live post.</w:t>
+      </w:r>
+    </w:p>
+    <w:p>
+      <w:pPr>
+        <w:pStyle w:val="ListParagraph"/>
+        <w:numPr>
+          <w:ilvl w:val="0"/>
+          <w:numId w:val="3"/>
+        </w:numPr>
+        <w:spacing w:after="60"/>
+      </w:pPr>
+      <w:r>
+        <w:rPr>
+          <w:rFonts w:ascii="Montserrat" w:cs="Montserrat" w:eastAsia="Montserrat" w:hAnsi="Montserrat"/>
+          <w:color w:val="111111"/>
+          <w:sz w:val="20"/>
+          <w:szCs w:val="20"/>
+        </w:rPr>
+        <w:t xml:space="preserve">Deactivating KDNA Reading Time omits the read time cleanly with no error.</w:t>
+      </w:r>
+    </w:p>
+    <w:p>
+      <w:pPr>
+        <w:pStyle w:val="ListParagraph"/>
+        <w:numPr>
+          <w:ilvl w:val="0"/>
+          <w:numId w:val="3"/>
+        </w:numPr>
+        <w:spacing w:after="60"/>
+      </w:pPr>
+      <w:r>
+        <w:rPr>
+          <w:rFonts w:ascii="Montserrat" w:cs="Montserrat" w:eastAsia="Montserrat" w:hAnsi="Montserrat"/>
+          <w:color w:val="111111"/>
+          <w:sz w:val="20"/>
+          <w:szCs w:val="20"/>
+        </w:rPr>
+        <w:t xml:space="preserve">A post with no intro and no repeater rows is blocked with a clear warning.</w:t>
       </w:r>
     </w:p>
     <w:p>
@@ -5213,25 +6609,6 @@
           <w:szCs w:val="20"/>
         </w:rPr>
         <w:t xml:space="preserve">UTM parameters appear correctly on the article link and the CTA link.</w:t>
-      </w:r>
-    </w:p>
-    <w:p>
-      <w:pPr>
-        <w:pStyle w:val="ListParagraph"/>
-        <w:numPr>
-          <w:ilvl w:val="0"/>
-          <w:numId w:val="3"/>
-        </w:numPr>
-        <w:spacing w:after="60"/>
-      </w:pPr>
-      <w:r>
-        <w:rPr>
-          <w:rFonts w:ascii="Montserrat" w:cs="Montserrat" w:eastAsia="Montserrat" w:hAnsi="Montserrat"/>
-          <w:color w:val="111111"/>
-          <w:sz w:val="20"/>
-          <w:szCs w:val="20"/>
-        </w:rPr>
-        <w:t xml:space="preserve">The preview panel matches what would be sent.</w:t>
       </w:r>
     </w:p>
     <w:p>
@@ -5263,7 +6640,7 @@
           <w:sz w:val="18"/>
           <w:szCs w:val="18"/>
         </w:rPr>
-        <w:t xml:space="preserve">Read PROJECT_BRIEF.docx. Build Stage 4 only: the content assembly engine for KDNA Article Broadcast. Build teaser generation with markup stripping and configurable word count, the email image size and placeholder fallback, read time, category, author, date formatting, CTA label, and the UTM builder. Add the settings page preview panel. No sending logic in this stage. Do not build any later stage.</w:t>
+        <w:t xml:space="preserve">Read PROJECT_BRIEF.docx, section 5 in particular. Build Stage 4 only: the content assembly engine for KDNA Article Broadcast. Content does not live in post_content on this site, it lives in JetEngine fields. Build the settings field mapping dropdowns, JetEngine repeater JSON decoding walked in row order, teaser generation starting from the intro field and continuing into the first repeater row only if needed, HTML and shortcode stripping, character entity conversion for trademark symbols and curly punctuation, the three-level image fallback, the read time lookup from KDNA Reading Time with graceful degradation, category, author, date, CTA label, and the UTM builder. Add the settings page preview panel and the empty-content block. No sending logic in this stage. Do not build any later stage.</w:t>
       </w:r>
     </w:p>
     <w:p>
@@ -8471,7 +9848,7 @@
           <w:sz w:val="30"/>
           <w:szCs w:val="30"/>
         </w:rPr>
-        <w:t xml:space="preserve">9. Testing checklist</w:t>
+        <w:t xml:space="preserve">10. Testing checklist</w:t>
       </w:r>
     </w:p>
     <w:p>
@@ -8567,6 +9944,82 @@
           <w:szCs w:val="20"/>
         </w:rPr>
         <w:t xml:space="preserve">A published post with the checkbox unticked does nothing at all.</w:t>
+      </w:r>
+    </w:p>
+    <w:p>
+      <w:pPr>
+        <w:pStyle w:val="ListParagraph"/>
+        <w:numPr>
+          <w:ilvl w:val="0"/>
+          <w:numId w:val="3"/>
+        </w:numPr>
+        <w:spacing w:after="60"/>
+      </w:pPr>
+      <w:r>
+        <w:rPr>
+          <w:rFonts w:ascii="Montserrat" w:cs="Montserrat" w:eastAsia="Montserrat" w:hAnsi="Montserrat"/>
+          <w:color w:val="111111"/>
+          <w:sz w:val="20"/>
+          <w:szCs w:val="20"/>
+        </w:rPr>
+        <w:t xml:space="preserve">The teaser reads from the intro field and only pulls from the first repeater row when the intro is too short.</w:t>
+      </w:r>
+    </w:p>
+    <w:p>
+      <w:pPr>
+        <w:pStyle w:val="ListParagraph"/>
+        <w:numPr>
+          <w:ilvl w:val="0"/>
+          <w:numId w:val="3"/>
+        </w:numPr>
+        <w:spacing w:after="60"/>
+      </w:pPr>
+      <w:r>
+        <w:rPr>
+          <w:rFonts w:ascii="Montserrat" w:cs="Montserrat" w:eastAsia="Montserrat" w:hAnsi="Montserrat"/>
+          <w:color w:val="111111"/>
+          <w:sz w:val="20"/>
+          <w:szCs w:val="20"/>
+        </w:rPr>
+        <w:t xml:space="preserve">Trademark symbols and curly punctuation render correctly in Gmail and Outlook, not as garbled characters.</w:t>
+      </w:r>
+    </w:p>
+    <w:p>
+      <w:pPr>
+        <w:pStyle w:val="ListParagraph"/>
+        <w:numPr>
+          <w:ilvl w:val="0"/>
+          <w:numId w:val="3"/>
+        </w:numPr>
+        <w:spacing w:after="60"/>
+      </w:pPr>
+      <w:r>
+        <w:rPr>
+          <w:rFonts w:ascii="Montserrat" w:cs="Montserrat" w:eastAsia="Montserrat" w:hAnsi="Montserrat"/>
+          <w:color w:val="111111"/>
+          <w:sz w:val="20"/>
+          <w:szCs w:val="20"/>
+        </w:rPr>
+        <w:t xml:space="preserve">The image falls back correctly through featured image, first section image, then placeholder.</w:t>
+      </w:r>
+    </w:p>
+    <w:p>
+      <w:pPr>
+        <w:pStyle w:val="ListParagraph"/>
+        <w:numPr>
+          <w:ilvl w:val="0"/>
+          <w:numId w:val="3"/>
+        </w:numPr>
+        <w:spacing w:after="60"/>
+      </w:pPr>
+      <w:r>
+        <w:rPr>
+          <w:rFonts w:ascii="Montserrat" w:cs="Montserrat" w:eastAsia="Montserrat" w:hAnsi="Montserrat"/>
+          <w:color w:val="111111"/>
+          <w:sz w:val="20"/>
+          <w:szCs w:val="20"/>
+        </w:rPr>
+        <w:t xml:space="preserve">Read time in the email matches the figure shown on the live post.</w:t>
       </w:r>
     </w:p>
     <w:p>
@@ -8875,7 +10328,7 @@
           <w:sz w:val="30"/>
           <w:szCs w:val="30"/>
         </w:rPr>
-        <w:t xml:space="preserve">10. Outstanding pre-build items</w:t>
+        <w:t xml:space="preserve">11. Outstanding pre-build items</w:t>
       </w:r>
     </w:p>
     <w:p>
@@ -9858,6 +11311,175 @@
           </w:p>
         </w:tc>
       </w:tr>
+      <w:tr>
+        <w:tc>
+          <w:tcPr>
+            <w:tcW w:type="dxa" w:w="4200"/>
+            <w:tcMar>
+              <w:top w:type="dxa" w:w="90"/>
+              <w:left w:type="dxa" w:w="120"/>
+              <w:bottom w:type="dxa" w:w="90"/>
+              <w:right w:type="dxa" w:w="120"/>
+            </w:tcMar>
+          </w:tcPr>
+          <w:p>
+            <w:pPr>
+              <w:spacing w:after="0"/>
+            </w:pPr>
+            <w:r>
+              <w:rPr>
+                <w:rFonts w:ascii="Montserrat" w:cs="Montserrat" w:eastAsia="Montserrat" w:hAnsi="Montserrat"/>
+                <w:b w:val="false"/>
+                <w:bCs w:val="false"/>
+                <w:color w:val="111111"/>
+                <w:sz w:val="18"/>
+                <w:szCs w:val="18"/>
+              </w:rPr>
+              <w:t xml:space="preserve">Confirm the intro field meta key</w:t>
+            </w:r>
+          </w:p>
+        </w:tc>
+        <w:tc>
+          <w:tcPr>
+            <w:tcW w:type="dxa" w:w="2600"/>
+            <w:tcMar>
+              <w:top w:type="dxa" w:w="90"/>
+              <w:left w:type="dxa" w:w="120"/>
+              <w:bottom w:type="dxa" w:w="90"/>
+              <w:right w:type="dxa" w:w="120"/>
+            </w:tcMar>
+          </w:tcPr>
+          <w:p>
+            <w:pPr>
+              <w:spacing w:after="0"/>
+            </w:pPr>
+            <w:r>
+              <w:rPr>
+                <w:rFonts w:ascii="Montserrat" w:cs="Montserrat" w:eastAsia="Montserrat" w:hAnsi="Montserrat"/>
+                <w:b w:val="false"/>
+                <w:bCs w:val="false"/>
+                <w:color w:val="111111"/>
+                <w:sz w:val="18"/>
+                <w:szCs w:val="18"/>
+              </w:rPr>
+              <w:t xml:space="preserve">Stage 4</w:t>
+            </w:r>
+          </w:p>
+        </w:tc>
+        <w:tc>
+          <w:tcPr>
+            <w:tcW w:type="dxa" w:w="2226"/>
+            <w:tcMar>
+              <w:top w:type="dxa" w:w="90"/>
+              <w:left w:type="dxa" w:w="120"/>
+              <w:bottom w:type="dxa" w:w="90"/>
+              <w:right w:type="dxa" w:w="120"/>
+            </w:tcMar>
+          </w:tcPr>
+          <w:p>
+            <w:pPr>
+              <w:spacing w:after="0"/>
+            </w:pPr>
+            <w:r>
+              <w:rPr>
+                <w:rFonts w:ascii="Montserrat" w:cs="Montserrat" w:eastAsia="Montserrat" w:hAnsi="Montserrat"/>
+                <w:b w:val="false"/>
+                <w:bCs w:val="false"/>
+                <w:color w:val="111111"/>
+                <w:sz w:val="18"/>
+                <w:szCs w:val="18"/>
+              </w:rPr>
+              <w:t xml:space="preserve">Selected in settings, no code change needed</w:t>
+            </w:r>
+          </w:p>
+        </w:tc>
+      </w:tr>
+      <w:tr>
+        <w:tc>
+          <w:tcPr>
+            <w:tcW w:type="dxa" w:w="4200"/>
+            <w:shd w:fill="EDEFEE" w:color="auto" w:val="clear"/>
+            <w:tcMar>
+              <w:top w:type="dxa" w:w="90"/>
+              <w:left w:type="dxa" w:w="120"/>
+              <w:bottom w:type="dxa" w:w="90"/>
+              <w:right w:type="dxa" w:w="120"/>
+            </w:tcMar>
+          </w:tcPr>
+          <w:p>
+            <w:pPr>
+              <w:spacing w:after="0"/>
+            </w:pPr>
+            <w:r>
+              <w:rPr>
+                <w:rFonts w:ascii="Montserrat" w:cs="Montserrat" w:eastAsia="Montserrat" w:hAnsi="Montserrat"/>
+                <w:b w:val="false"/>
+                <w:bCs w:val="false"/>
+                <w:color w:val="111111"/>
+                <w:sz w:val="18"/>
+                <w:szCs w:val="18"/>
+              </w:rPr>
+              <w:t xml:space="preserve">Confirm how KDNA Reading Time exposes its value</w:t>
+            </w:r>
+          </w:p>
+        </w:tc>
+        <w:tc>
+          <w:tcPr>
+            <w:tcW w:type="dxa" w:w="2600"/>
+            <w:shd w:fill="EDEFEE" w:color="auto" w:val="clear"/>
+            <w:tcMar>
+              <w:top w:type="dxa" w:w="90"/>
+              <w:left w:type="dxa" w:w="120"/>
+              <w:bottom w:type="dxa" w:w="90"/>
+              <w:right w:type="dxa" w:w="120"/>
+            </w:tcMar>
+          </w:tcPr>
+          <w:p>
+            <w:pPr>
+              <w:spacing w:after="0"/>
+            </w:pPr>
+            <w:r>
+              <w:rPr>
+                <w:rFonts w:ascii="Montserrat" w:cs="Montserrat" w:eastAsia="Montserrat" w:hAnsi="Montserrat"/>
+                <w:b w:val="false"/>
+                <w:bCs w:val="false"/>
+                <w:color w:val="111111"/>
+                <w:sz w:val="18"/>
+                <w:szCs w:val="18"/>
+              </w:rPr>
+              <w:t xml:space="preserve">Stage 4</w:t>
+            </w:r>
+          </w:p>
+        </w:tc>
+        <w:tc>
+          <w:tcPr>
+            <w:tcW w:type="dxa" w:w="2226"/>
+            <w:shd w:fill="EDEFEE" w:color="auto" w:val="clear"/>
+            <w:tcMar>
+              <w:top w:type="dxa" w:w="90"/>
+              <w:left w:type="dxa" w:w="120"/>
+              <w:bottom w:type="dxa" w:w="90"/>
+              <w:right w:type="dxa" w:w="120"/>
+            </w:tcMar>
+          </w:tcPr>
+          <w:p>
+            <w:pPr>
+              <w:spacing w:after="0"/>
+            </w:pPr>
+            <w:r>
+              <w:rPr>
+                <w:rFonts w:ascii="Montserrat" w:cs="Montserrat" w:eastAsia="Montserrat" w:hAnsi="Montserrat"/>
+                <w:b w:val="false"/>
+                <w:bCs w:val="false"/>
+                <w:color w:val="111111"/>
+                <w:sz w:val="18"/>
+                <w:szCs w:val="18"/>
+              </w:rPr>
+              <w:t xml:space="preserve">Check for a public function or post meta key</w:t>
+            </w:r>
+          </w:p>
+        </w:tc>
+      </w:tr>
     </w:tbl>
     <w:p>
       <w:pPr>
@@ -9887,7 +11509,7 @@
           <w:sz w:val="30"/>
           <w:szCs w:val="30"/>
         </w:rPr>
-        <w:t xml:space="preserve">11. Current build status</w:t>
+        <w:t xml:space="preserve">12. Current build status</w:t>
       </w:r>
     </w:p>
     <w:p>
@@ -11537,7 +13159,7 @@
           <w:sz w:val="30"/>
           <w:szCs w:val="30"/>
         </w:rPr>
-        <w:t xml:space="preserve">12. KDNA conventions</w:t>
+        <w:t xml:space="preserve">13. KDNA conventions</w:t>
       </w:r>
     </w:p>
     <w:p>
@@ -11852,7 +13474,7 @@
           <w:sz w:val="30"/>
           <w:szCs w:val="30"/>
         </w:rPr>
-        <w:t xml:space="preserve">13. Note on the Klaviyo build</w:t>
+        <w:t xml:space="preserve">14. Note on the Klaviyo build</w:t>
       </w:r>
     </w:p>
     <w:p>

</xml_diff>